<commit_message>
Rebrand to YenkoExpress (yenkoexpress.com)
Default site name, sender and placeholder examples, docs, README, SRS sources and
PDF/Word builds now use YenkoExpress; installs still on the old default name are
renamed at start-up. The Render service name, the encryption salt and the UKG-
order prefix are deliberately unchanged. Docs gain a domain-connection checklist.

Co-Authored-By: Claude Sonnet 5.5 <noreply@anthropic.com>
Claude-Session: https://claude.ai/code/session_019DA74PgeWyV7f6WtdreRuq
</commit_message>
<xml_diff>
--- a/docs/pdf/SRS-Anknovate.docx
+++ b/docs/pdf/SRS-Anknovate.docx
@@ -73,7 +73,7 @@
           <w:sz w:val="30"/>
           <w:szCs w:val="30"/>
         </w:rPr>
-        <w:t xml:space="preserve">SHOP UK FROM GH: UK shopping, shipping and delivery for Ghana</w:t>
+        <w:t xml:space="preserve">YenkoExpress: UK shopping, shipping and delivery for Ghana</w:t>
       </w:r>
     </w:p>
     <w:p>
@@ -327,7 +327,7 @@
                 <w:sz w:val="21"/>
                 <w:szCs w:val="21"/>
               </w:rPr>
-              <w:t xml:space="preserve">The owner of SHOP UK FROM GH</w:t>
+              <w:t xml:space="preserve">The owner of YenkoExpress</w:t>
             </w:r>
           </w:p>
         </w:tc>
@@ -566,7 +566,7 @@
         <w:tab/>
       </w:r>
       <w:r>
-        <w:t>19</w:t>
+        <w:t>21</w:t>
       </w:r>
     </w:p>
     <w:p>
@@ -583,7 +583,7 @@
         <w:tab/>
       </w:r>
       <w:r>
-        <w:t>21</w:t>
+        <w:t>23</w:t>
       </w:r>
     </w:p>
     <w:p>
@@ -600,7 +600,7 @@
         <w:tab/>
       </w:r>
       <w:r>
-        <w:t>24</w:t>
+        <w:t>25</w:t>
       </w:r>
     </w:p>
     <w:p>
@@ -617,7 +617,7 @@
         <w:tab/>
       </w:r>
       <w:r>
-        <w:t>24</w:t>
+        <w:t>26</w:t>
       </w:r>
     </w:p>
     <w:p>
@@ -634,7 +634,7 @@
         <w:tab/>
       </w:r>
       <w:r>
-        <w:t>25</w:t>
+        <w:t>27</w:t>
       </w:r>
     </w:p>
     <w:p>
@@ -651,7 +651,7 @@
         <w:tab/>
       </w:r>
       <w:r>
-        <w:t>27</w:t>
+        <w:t>29</w:t>
       </w:r>
     </w:p>
     <w:p>
@@ -668,7 +668,7 @@
         <w:tab/>
       </w:r>
       <w:r>
-        <w:t>29</w:t>
+        <w:t>31</w:t>
       </w:r>
     </w:p>
     <w:p>
@@ -685,7 +685,7 @@
         <w:tab/>
       </w:r>
       <w:r>
-        <w:t>29</w:t>
+        <w:t>31</w:t>
       </w:r>
     </w:p>
     <w:p>
@@ -702,7 +702,7 @@
         <w:tab/>
       </w:r>
       <w:r>
-        <w:t>30</w:t>
+        <w:t>32</w:t>
       </w:r>
     </w:p>
     <w:p>
@@ -719,7 +719,7 @@
         <w:tab/>
       </w:r>
       <w:r>
-        <w:t>31</w:t>
+        <w:t>33</w:t>
       </w:r>
       <w:r>
         <w:fldChar w:fldCharType="end"/>
@@ -840,7 +840,7 @@
           <w:bCs/>
           <w:b/>
         </w:rPr>
-        <w:t xml:space="preserve">SHOP UK FROM GH</w:t>
+        <w:t xml:space="preserve">YenkoExpress</w:t>
       </w:r>
       <w:r>
         <w:t xml:space="preserve">, a web system that lets shoppers in Ghana buy goods from UK retailers and pay once in Ghana cedis (GHS), while the operator buys the goods in the UK, ships them to Ghana and has a third-party courier deliver them. It is the reference for deciding whether the system is correct and complete, for planning changes, and for acceptance testing.</w:t>
@@ -1229,7 +1229,7 @@
         <w:pStyle w:val="Compact"/>
       </w:pPr>
       <w:r>
-        <w:t xml:space="preserve">Provider documentation for Stripe, Paystack, Flutterwave, Arkesel, Twilio, Meta WhatsApp Cloud API, Resend, Postmark, ExchangeRate-API, Open Exchange Rates and the eBay Browse API (linked from the Integrations page).</w:t>
+        <w:t xml:space="preserve">Provider documentation for Stripe, Paystack, Flutterwave, Arkesel, Twilio, Meta WhatsApp Cloud API, Resend, Postmark, ExchangeRate-API, Open Exchange Rates the eBay Browse API and the Diffbot Product API (linked from the Integrations page).</w:t>
       </w:r>
     </w:p>
     <w:bookmarkEnd w:id="33"/>
@@ -1592,7 +1592,7 @@
           <w:sz w:val="17"/>
           <w:szCs w:val="17"/>
         </w:rPr>
-        <w:t xml:space="preserve">  Payment gateways   Messaging   Exchange-rate   eBay API / Shopify / feeds / shop pages</w:t>
+        <w:t xml:space="preserve">  Payment gateways   Messaging   Exchange-rate   eBay / Diffbot / Shopify / feeds / pages</w:t>
       </w:r>
       <w:r>
         <w:br/>
@@ -3909,6 +3909,71 @@
               <w:jc w:val="left"/>
             </w:pPr>
             <w:r>
+              <w:t xml:space="preserve">IR-EX-12</w:t>
+            </w:r>
+          </w:p>
+        </w:tc>
+        <w:tc>
+          <w:tcPr>
+            <w:tcW w:w="1900" w:type="dxa"/>
+          </w:tcPr>
+          <w:p>
+            <w:pPr>
+              <w:pStyle w:val="Compact"/>
+              <w:jc w:val="left"/>
+            </w:pPr>
+            <w:r>
+              <w:rPr>
+                <w:bCs/>
+                <w:b/>
+              </w:rPr>
+              <w:t xml:space="preserve">Diffbot Product API</w:t>
+            </w:r>
+          </w:p>
+        </w:tc>
+        <w:tc>
+          <w:tcPr>
+            <w:tcW w:w="1295" w:type="dxa"/>
+          </w:tcPr>
+          <w:p>
+            <w:pPr>
+              <w:pStyle w:val="Compact"/>
+              <w:jc w:val="left"/>
+            </w:pPr>
+            <w:r>
+              <w:t xml:space="preserve">out</w:t>
+            </w:r>
+          </w:p>
+        </w:tc>
+        <w:tc>
+          <w:tcPr>
+            <w:tcW w:w="4985" w:type="dxa"/>
+          </w:tcPr>
+          <w:p>
+            <w:pPr>
+              <w:pStyle w:val="Compact"/>
+              <w:jc w:val="left"/>
+            </w:pPr>
+            <w:r>
+              <w:t xml:space="preserve">Read each listed product page by token; only prices in GBP; stop on bad token, no credits or rate limit.</w:t>
+            </w:r>
+          </w:p>
+        </w:tc>
+      </w:tr>
+      <w:tr>
+        <w:trPr>
+          <w:cantSplit/>
+        </w:trPr>
+        <w:tc>
+          <w:tcPr>
+            <w:tcW w:w="1180" w:type="dxa"/>
+          </w:tcPr>
+          <w:p>
+            <w:pPr>
+              <w:pStyle w:val="Compact"/>
+              <w:jc w:val="left"/>
+            </w:pPr>
+            <w:r>
               <w:t xml:space="preserve">IR-EX-08</w:t>
             </w:r>
           </w:p>
@@ -4051,97 +4116,94 @@
               <w:t xml:space="preserve">/products.json</w:t>
             </w:r>
             <w:r>
-              <w:t xml:space="preserve">, and product pages, subject to FR-CAT-30 to FR-CAT-33.</w:t>
-            </w:r>
-          </w:p>
-        </w:tc>
-      </w:tr>
-      <w:tr>
-        <w:trPr>
-          <w:cantSplit/>
-        </w:trPr>
-        <w:tc>
-          <w:tcPr>
-            <w:tcW w:w="1180" w:type="dxa"/>
-          </w:tcPr>
-          <w:p>
-            <w:pPr>
-              <w:pStyle w:val="Compact"/>
-              <w:jc w:val="left"/>
-            </w:pPr>
-            <w:r>
-              <w:t xml:space="preserve">IR-EX-10</w:t>
-            </w:r>
-          </w:p>
-        </w:tc>
-        <w:tc>
-          <w:tcPr>
-            <w:tcW w:w="1900" w:type="dxa"/>
-          </w:tcPr>
-          <w:p>
-            <w:pPr>
-              <w:pStyle w:val="Compact"/>
-              <w:jc w:val="left"/>
-            </w:pPr>
-            <w:r>
-              <w:rPr>
-                <w:bCs/>
-                <w:b/>
-              </w:rPr>
-              <w:t xml:space="preserve">Inbound endpoints</w:t>
-            </w:r>
-          </w:p>
-        </w:tc>
-        <w:tc>
-          <w:tcPr>
-            <w:tcW w:w="1295" w:type="dxa"/>
-          </w:tcPr>
-          <w:p>
-            <w:pPr>
-              <w:pStyle w:val="Compact"/>
-              <w:jc w:val="left"/>
-            </w:pPr>
-            <w:r>
-              <w:t xml:space="preserve">in</w:t>
-            </w:r>
-          </w:p>
-        </w:tc>
-        <w:tc>
-          <w:tcPr>
-            <w:tcW w:w="4985" w:type="dxa"/>
-          </w:tcPr>
-          <w:p>
-            <w:pPr>
-              <w:pStyle w:val="Compact"/>
-              <w:jc w:val="left"/>
-            </w:pPr>
+              <w:t xml:space="preserve">, WooCommerce</w:t>
+            </w:r>
+            <w:r>
+              <w:t xml:space="preserve"> </w:t>
+            </w:r>
             <w:r>
               <w:rPr>
                 <w:rStyle w:val="VerbatimChar"/>
                 <w:sz w:val="16"/>
                 <w:szCs w:val="16"/>
               </w:rPr>
-              <w:t xml:space="preserve">/api/webhooks/{stripe,paystack,flutterwave}</w:t>
-            </w:r>
-            <w:r>
-              <w:t xml:space="preserve">;</w:t>
-            </w:r>
-            <w:r>
-              <w:t xml:space="preserve"> </w:t>
-            </w:r>
+              <w:t xml:space="preserve">/wp-json/wc/store/v1/products</w:t>
+            </w:r>
+            <w:r>
+              <w:t xml:space="preserve">, and product pages, subject to FR-CAT-30 to FR-CAT-33.</w:t>
+            </w:r>
+          </w:p>
+        </w:tc>
+      </w:tr>
+      <w:tr>
+        <w:trPr>
+          <w:cantSplit/>
+        </w:trPr>
+        <w:tc>
+          <w:tcPr>
+            <w:tcW w:w="1180" w:type="dxa"/>
+          </w:tcPr>
+          <w:p>
+            <w:pPr>
+              <w:pStyle w:val="Compact"/>
+              <w:jc w:val="left"/>
+            </w:pPr>
+            <w:r>
+              <w:t xml:space="preserve">IR-EX-10</w:t>
+            </w:r>
+          </w:p>
+        </w:tc>
+        <w:tc>
+          <w:tcPr>
+            <w:tcW w:w="1900" w:type="dxa"/>
+          </w:tcPr>
+          <w:p>
+            <w:pPr>
+              <w:pStyle w:val="Compact"/>
+              <w:jc w:val="left"/>
+            </w:pPr>
+            <w:r>
+              <w:rPr>
+                <w:bCs/>
+                <w:b/>
+              </w:rPr>
+              <w:t xml:space="preserve">Inbound endpoints</w:t>
+            </w:r>
+          </w:p>
+        </w:tc>
+        <w:tc>
+          <w:tcPr>
+            <w:tcW w:w="1295" w:type="dxa"/>
+          </w:tcPr>
+          <w:p>
+            <w:pPr>
+              <w:pStyle w:val="Compact"/>
+              <w:jc w:val="left"/>
+            </w:pPr>
+            <w:r>
+              <w:t xml:space="preserve">in</w:t>
+            </w:r>
+          </w:p>
+        </w:tc>
+        <w:tc>
+          <w:tcPr>
+            <w:tcW w:w="4985" w:type="dxa"/>
+          </w:tcPr>
+          <w:p>
+            <w:pPr>
+              <w:pStyle w:val="Compact"/>
+              <w:jc w:val="left"/>
+            </w:pPr>
             <w:r>
               <w:rPr>
                 <w:rStyle w:val="VerbatimChar"/>
                 <w:sz w:val="16"/>
                 <w:szCs w:val="16"/>
               </w:rPr>
-              <w:t xml:space="preserve">/api/cron/{messages,fx,ingest}</w:t>
-            </w:r>
-            <w:r>
-              <w:t xml:space="preserve"> </w:t>
-            </w:r>
-            <w:r>
-              <w:t xml:space="preserve">(bearer secret);</w:t>
+              <w:t xml:space="preserve">/api/webhooks/{stripe,paystack,flutterwave}</w:t>
+            </w:r>
+            <w:r>
+              <w:t xml:space="preserve">;</w:t>
             </w:r>
             <w:r>
               <w:t xml:space="preserve"> </w:t>
@@ -4152,10 +4214,92 @@
                 <w:sz w:val="16"/>
                 <w:szCs w:val="16"/>
               </w:rPr>
+              <w:t xml:space="preserve">/api/cron/{messages,fx,ingest}</w:t>
+            </w:r>
+            <w:r>
+              <w:t xml:space="preserve"> </w:t>
+            </w:r>
+            <w:r>
+              <w:t xml:space="preserve">(bearer secret);</w:t>
+            </w:r>
+            <w:r>
+              <w:t xml:space="preserve"> </w:t>
+            </w:r>
+            <w:r>
+              <w:rPr>
+                <w:rStyle w:val="VerbatimChar"/>
+                <w:sz w:val="16"/>
+                <w:szCs w:val="16"/>
+              </w:rPr>
               <w:t xml:space="preserve">/api/health</w:t>
             </w:r>
             <w:r>
               <w:t xml:space="preserve">.</w:t>
+            </w:r>
+          </w:p>
+        </w:tc>
+      </w:tr>
+      <w:tr>
+        <w:trPr>
+          <w:cantSplit/>
+        </w:trPr>
+        <w:tc>
+          <w:tcPr>
+            <w:tcW w:w="1180" w:type="dxa"/>
+          </w:tcPr>
+          <w:p>
+            <w:pPr>
+              <w:pStyle w:val="Compact"/>
+              <w:jc w:val="left"/>
+            </w:pPr>
+            <w:r>
+              <w:t xml:space="preserve">IR-EX-13</w:t>
+            </w:r>
+          </w:p>
+        </w:tc>
+        <w:tc>
+          <w:tcPr>
+            <w:tcW w:w="1900" w:type="dxa"/>
+          </w:tcPr>
+          <w:p>
+            <w:pPr>
+              <w:pStyle w:val="Compact"/>
+              <w:jc w:val="left"/>
+            </w:pPr>
+            <w:r>
+              <w:rPr>
+                <w:bCs/>
+                <w:b/>
+              </w:rPr>
+              <w:t xml:space="preserve">Sign in with Google, Facebook and Apple</w:t>
+            </w:r>
+          </w:p>
+        </w:tc>
+        <w:tc>
+          <w:tcPr>
+            <w:tcW w:w="1295" w:type="dxa"/>
+          </w:tcPr>
+          <w:p>
+            <w:pPr>
+              <w:pStyle w:val="Compact"/>
+              <w:jc w:val="left"/>
+            </w:pPr>
+            <w:r>
+              <w:t xml:space="preserve">out</w:t>
+            </w:r>
+          </w:p>
+        </w:tc>
+        <w:tc>
+          <w:tcPr>
+            <w:tcW w:w="4985" w:type="dxa"/>
+          </w:tcPr>
+          <w:p>
+            <w:pPr>
+              <w:pStyle w:val="Compact"/>
+              <w:jc w:val="left"/>
+            </w:pPr>
+            <w:r>
+              <w:t xml:space="preserve">OpenID Connect and OAuth 2.0 authorisation-code flows over HTTPS; Google and Apple identify the person by an ID token from the token endpoint, Facebook by its Graph profile.</w:t>
             </w:r>
           </w:p>
         </w:tc>
@@ -6443,9 +6587,9 @@
       </w:tblPr>
       <w:tblGrid>
         <w:gridCol w:w="1295"/>
-        <w:gridCol w:w="5154"/>
+        <w:gridCol w:w="5121"/>
         <w:gridCol w:w="605"/>
-        <w:gridCol w:w="2306"/>
+        <w:gridCol w:w="2339"/>
       </w:tblGrid>
       <w:tr>
         <w:trPr>
@@ -6470,7 +6614,7 @@
         </w:tc>
         <w:tc>
           <w:tcPr>
-            <w:tcW w:w="5154" w:type="dxa"/>
+            <w:tcW w:w="5121" w:type="dxa"/>
           </w:tcPr>
           <w:p>
             <w:pPr>
@@ -6498,7 +6642,7 @@
         </w:tc>
         <w:tc>
           <w:tcPr>
-            <w:tcW w:w="2306" w:type="dxa"/>
+            <w:tcW w:w="2339" w:type="dxa"/>
           </w:tcPr>
           <w:p>
             <w:pPr>
@@ -6531,7 +6675,7 @@
         </w:tc>
         <w:tc>
           <w:tcPr>
-            <w:tcW w:w="5154" w:type="dxa"/>
+            <w:tcW w:w="5121" w:type="dxa"/>
           </w:tcPr>
           <w:p>
             <w:pPr>
@@ -6559,7 +6703,7 @@
         </w:tc>
         <w:tc>
           <w:tcPr>
-            <w:tcW w:w="2306" w:type="dxa"/>
+            <w:tcW w:w="2339" w:type="dxa"/>
           </w:tcPr>
           <w:p>
             <w:pPr>
@@ -6614,7 +6758,7 @@
         </w:tc>
         <w:tc>
           <w:tcPr>
-            <w:tcW w:w="5154" w:type="dxa"/>
+            <w:tcW w:w="5121" w:type="dxa"/>
           </w:tcPr>
           <w:p>
             <w:pPr>
@@ -6642,7 +6786,7 @@
         </w:tc>
         <w:tc>
           <w:tcPr>
-            <w:tcW w:w="2306" w:type="dxa"/>
+            <w:tcW w:w="2339" w:type="dxa"/>
           </w:tcPr>
           <w:p>
             <w:pPr>
@@ -6694,7 +6838,7 @@
         </w:tc>
         <w:tc>
           <w:tcPr>
-            <w:tcW w:w="5154" w:type="dxa"/>
+            <w:tcW w:w="5121" w:type="dxa"/>
           </w:tcPr>
           <w:p>
             <w:pPr>
@@ -6722,7 +6866,7 @@
         </w:tc>
         <w:tc>
           <w:tcPr>
-            <w:tcW w:w="2306" w:type="dxa"/>
+            <w:tcW w:w="2339" w:type="dxa"/>
           </w:tcPr>
           <w:p>
             <w:pPr>
@@ -6760,7 +6904,7 @@
         </w:tc>
         <w:tc>
           <w:tcPr>
-            <w:tcW w:w="5154" w:type="dxa"/>
+            <w:tcW w:w="5121" w:type="dxa"/>
           </w:tcPr>
           <w:p>
             <w:pPr>
@@ -6788,7 +6932,7 @@
         </w:tc>
         <w:tc>
           <w:tcPr>
-            <w:tcW w:w="2306" w:type="dxa"/>
+            <w:tcW w:w="2339" w:type="dxa"/>
           </w:tcPr>
           <w:p>
             <w:pPr>
@@ -6826,7 +6970,7 @@
         </w:tc>
         <w:tc>
           <w:tcPr>
-            <w:tcW w:w="5154" w:type="dxa"/>
+            <w:tcW w:w="5121" w:type="dxa"/>
           </w:tcPr>
           <w:p>
             <w:pPr>
@@ -6854,7 +6998,7 @@
         </w:tc>
         <w:tc>
           <w:tcPr>
-            <w:tcW w:w="2306" w:type="dxa"/>
+            <w:tcW w:w="2339" w:type="dxa"/>
           </w:tcPr>
           <w:p>
             <w:pPr>
@@ -6892,7 +7036,7 @@
         </w:tc>
         <w:tc>
           <w:tcPr>
-            <w:tcW w:w="5154" w:type="dxa"/>
+            <w:tcW w:w="5121" w:type="dxa"/>
           </w:tcPr>
           <w:p>
             <w:pPr>
@@ -6920,7 +7064,7 @@
         </w:tc>
         <w:tc>
           <w:tcPr>
-            <w:tcW w:w="2306" w:type="dxa"/>
+            <w:tcW w:w="2339" w:type="dxa"/>
           </w:tcPr>
           <w:p>
             <w:pPr>
@@ -6958,7 +7102,7 @@
         </w:tc>
         <w:tc>
           <w:tcPr>
-            <w:tcW w:w="5154" w:type="dxa"/>
+            <w:tcW w:w="5121" w:type="dxa"/>
           </w:tcPr>
           <w:p>
             <w:pPr>
@@ -6986,7 +7130,7 @@
         </w:tc>
         <w:tc>
           <w:tcPr>
-            <w:tcW w:w="2306" w:type="dxa"/>
+            <w:tcW w:w="2339" w:type="dxa"/>
           </w:tcPr>
           <w:p>
             <w:pPr>
@@ -7027,7 +7171,7 @@
         </w:tc>
         <w:tc>
           <w:tcPr>
-            <w:tcW w:w="5154" w:type="dxa"/>
+            <w:tcW w:w="5121" w:type="dxa"/>
           </w:tcPr>
           <w:p>
             <w:pPr>
@@ -7055,7 +7199,7 @@
         </w:tc>
         <w:tc>
           <w:tcPr>
-            <w:tcW w:w="2306" w:type="dxa"/>
+            <w:tcW w:w="2339" w:type="dxa"/>
           </w:tcPr>
           <w:p>
             <w:pPr>
@@ -7093,7 +7237,7 @@
         </w:tc>
         <w:tc>
           <w:tcPr>
-            <w:tcW w:w="5154" w:type="dxa"/>
+            <w:tcW w:w="5121" w:type="dxa"/>
           </w:tcPr>
           <w:p>
             <w:pPr>
@@ -7121,7 +7265,7 @@
         </w:tc>
         <w:tc>
           <w:tcPr>
-            <w:tcW w:w="2306" w:type="dxa"/>
+            <w:tcW w:w="2339" w:type="dxa"/>
           </w:tcPr>
           <w:p>
             <w:pPr>
@@ -7159,13 +7303,443 @@
               <w:jc w:val="left"/>
             </w:pPr>
             <w:r>
+              <w:t xml:space="preserve">FR-ACC-12</w:t>
+            </w:r>
+          </w:p>
+        </w:tc>
+        <w:tc>
+          <w:tcPr>
+            <w:tcW w:w="5121" w:type="dxa"/>
+          </w:tcPr>
+          <w:p>
+            <w:pPr>
+              <w:pStyle w:val="Compact"/>
+              <w:jc w:val="left"/>
+            </w:pPr>
+            <w:r>
+              <w:t xml:space="preserve">A customer shall be able to sign in or sign up with Google, Facebook or Apple when the shop owner has set that provider up and switched it on, and to connect further providers to an existing account.</w:t>
+            </w:r>
+          </w:p>
+        </w:tc>
+        <w:tc>
+          <w:tcPr>
+            <w:tcW w:w="605" w:type="dxa"/>
+          </w:tcPr>
+          <w:p>
+            <w:pPr>
+              <w:pStyle w:val="Compact"/>
+              <w:jc w:val="left"/>
+            </w:pPr>
+            <w:r>
+              <w:t xml:space="preserve">S</w:t>
+            </w:r>
+          </w:p>
+        </w:tc>
+        <w:tc>
+          <w:tcPr>
+            <w:tcW w:w="2339" w:type="dxa"/>
+          </w:tcPr>
+          <w:p>
+            <w:pPr>
+              <w:pStyle w:val="Compact"/>
+              <w:jc w:val="left"/>
+            </w:pPr>
+            <w:r>
+              <w:rPr>
+                <w:rStyle w:val="VerbatimChar"/>
+                <w:sz w:val="16"/>
+                <w:szCs w:val="16"/>
+              </w:rPr>
+              <w:t xml:space="preserve">social.test.ts</w:t>
+            </w:r>
+            <w:r>
+              <w:t xml:space="preserve">; E2E "social sign-in"</w:t>
+            </w:r>
+          </w:p>
+        </w:tc>
+      </w:tr>
+      <w:tr>
+        <w:trPr>
+          <w:cantSplit/>
+        </w:trPr>
+        <w:tc>
+          <w:tcPr>
+            <w:tcW w:w="1295" w:type="dxa"/>
+          </w:tcPr>
+          <w:p>
+            <w:pPr>
+              <w:pStyle w:val="Compact"/>
+              <w:jc w:val="left"/>
+            </w:pPr>
+            <w:r>
+              <w:t xml:space="preserve">FR-ACC-13</w:t>
+            </w:r>
+          </w:p>
+        </w:tc>
+        <w:tc>
+          <w:tcPr>
+            <w:tcW w:w="5121" w:type="dxa"/>
+          </w:tcPr>
+          <w:p>
+            <w:pPr>
+              <w:pStyle w:val="Compact"/>
+              <w:jc w:val="left"/>
+            </w:pPr>
+            <w:r>
+              <w:t xml:space="preserve">An existing account shall be matched to a provider sign-in only by the provider's own id, or by an email address the provider itself reports as verified (Google, Apple). An unverified email (Facebook), a phone number or a name shall never connect or take over an account.</w:t>
+            </w:r>
+          </w:p>
+        </w:tc>
+        <w:tc>
+          <w:tcPr>
+            <w:tcW w:w="605" w:type="dxa"/>
+          </w:tcPr>
+          <w:p>
+            <w:pPr>
+              <w:pStyle w:val="Compact"/>
+              <w:jc w:val="left"/>
+            </w:pPr>
+            <w:r>
+              <w:t xml:space="preserve">M</w:t>
+            </w:r>
+          </w:p>
+        </w:tc>
+        <w:tc>
+          <w:tcPr>
+            <w:tcW w:w="2339" w:type="dxa"/>
+          </w:tcPr>
+          <w:p>
+            <w:pPr>
+              <w:pStyle w:val="Compact"/>
+              <w:jc w:val="left"/>
+            </w:pPr>
+            <w:r>
+              <w:rPr>
+                <w:rStyle w:val="VerbatimChar"/>
+                <w:sz w:val="16"/>
+                <w:szCs w:val="16"/>
+              </w:rPr>
+              <w:t xml:space="preserve">social.test.ts</w:t>
+            </w:r>
+          </w:p>
+        </w:tc>
+      </w:tr>
+      <w:tr>
+        <w:trPr>
+          <w:cantSplit/>
+        </w:trPr>
+        <w:tc>
+          <w:tcPr>
+            <w:tcW w:w="1295" w:type="dxa"/>
+          </w:tcPr>
+          <w:p>
+            <w:pPr>
+              <w:pStyle w:val="Compact"/>
+              <w:jc w:val="left"/>
+            </w:pPr>
+            <w:r>
+              <w:t xml:space="preserve">FR-ACC-14</w:t>
+            </w:r>
+          </w:p>
+        </w:tc>
+        <w:tc>
+          <w:tcPr>
+            <w:tcW w:w="5121" w:type="dxa"/>
+          </w:tcPr>
+          <w:p>
+            <w:pPr>
+              <w:pStyle w:val="Compact"/>
+              <w:jc w:val="left"/>
+            </w:pPr>
+            <w:r>
+              <w:t xml:space="preserve">Each provider sign-in attempt shall be single-use, expire in 10 minutes, be tied to the browser that began it by a cookie (SameSite=None where Apple's cross-site form post requires it), carry a state value, a nonce and, for Google, a PKCE challenge, and refuse an ID token of another issuer, audience, expiry or nonce.</w:t>
+            </w:r>
+          </w:p>
+        </w:tc>
+        <w:tc>
+          <w:tcPr>
+            <w:tcW w:w="605" w:type="dxa"/>
+          </w:tcPr>
+          <w:p>
+            <w:pPr>
+              <w:pStyle w:val="Compact"/>
+              <w:jc w:val="left"/>
+            </w:pPr>
+            <w:r>
+              <w:t xml:space="preserve">M</w:t>
+            </w:r>
+          </w:p>
+        </w:tc>
+        <w:tc>
+          <w:tcPr>
+            <w:tcW w:w="2339" w:type="dxa"/>
+          </w:tcPr>
+          <w:p>
+            <w:pPr>
+              <w:pStyle w:val="Compact"/>
+              <w:jc w:val="left"/>
+            </w:pPr>
+            <w:r>
+              <w:rPr>
+                <w:rStyle w:val="VerbatimChar"/>
+                <w:sz w:val="16"/>
+                <w:szCs w:val="16"/>
+              </w:rPr>
+              <w:t xml:space="preserve">social.test.ts</w:t>
+            </w:r>
+            <w:r>
+              <w:t xml:space="preserve">; E2E "social sign-in"</w:t>
+            </w:r>
+          </w:p>
+        </w:tc>
+      </w:tr>
+      <w:tr>
+        <w:trPr>
+          <w:cantSplit/>
+        </w:trPr>
+        <w:tc>
+          <w:tcPr>
+            <w:tcW w:w="1295" w:type="dxa"/>
+          </w:tcPr>
+          <w:p>
+            <w:pPr>
+              <w:pStyle w:val="Compact"/>
+              <w:jc w:val="left"/>
+            </w:pPr>
+            <w:r>
+              <w:t xml:space="preserve">FR-ACC-15</w:t>
+            </w:r>
+          </w:p>
+        </w:tc>
+        <w:tc>
+          <w:tcPr>
+            <w:tcW w:w="5121" w:type="dxa"/>
+          </w:tcPr>
+          <w:p>
+            <w:pPr>
+              <w:pStyle w:val="Compact"/>
+              <w:jc w:val="left"/>
+            </w:pPr>
+            <w:r>
+              <w:t xml:space="preserve">A first-time provider sign-in shall ask for a phone number before the account is created, because deliveries are arranged by phone; a phone number already on an account shall not be linked automatically.</w:t>
+            </w:r>
+          </w:p>
+        </w:tc>
+        <w:tc>
+          <w:tcPr>
+            <w:tcW w:w="605" w:type="dxa"/>
+          </w:tcPr>
+          <w:p>
+            <w:pPr>
+              <w:pStyle w:val="Compact"/>
+              <w:jc w:val="left"/>
+            </w:pPr>
+            <w:r>
+              <w:t xml:space="preserve">M</w:t>
+            </w:r>
+          </w:p>
+        </w:tc>
+        <w:tc>
+          <w:tcPr>
+            <w:tcW w:w="2339" w:type="dxa"/>
+          </w:tcPr>
+          <w:p>
+            <w:pPr>
+              <w:pStyle w:val="Compact"/>
+              <w:jc w:val="left"/>
+            </w:pPr>
+            <w:r>
+              <w:rPr>
+                <w:rStyle w:val="VerbatimChar"/>
+                <w:sz w:val="16"/>
+                <w:szCs w:val="16"/>
+              </w:rPr>
+              <w:t xml:space="preserve">social.test.ts</w:t>
+            </w:r>
+          </w:p>
+        </w:tc>
+      </w:tr>
+      <w:tr>
+        <w:trPr>
+          <w:cantSplit/>
+        </w:trPr>
+        <w:tc>
+          <w:tcPr>
+            <w:tcW w:w="1295" w:type="dxa"/>
+          </w:tcPr>
+          <w:p>
+            <w:pPr>
+              <w:pStyle w:val="Compact"/>
+              <w:jc w:val="left"/>
+            </w:pPr>
+            <w:r>
+              <w:t xml:space="preserve">FR-ACC-16</w:t>
+            </w:r>
+          </w:p>
+        </w:tc>
+        <w:tc>
+          <w:tcPr>
+            <w:tcW w:w="5121" w:type="dxa"/>
+          </w:tcPr>
+          <w:p>
+            <w:pPr>
+              <w:pStyle w:val="Compact"/>
+              <w:jc w:val="left"/>
+            </w:pPr>
+            <w:r>
+              <w:t xml:space="preserve">The shop shall publish a privacy policy (</w:t>
+            </w:r>
+            <w:r>
+              <w:rPr>
+                <w:rStyle w:val="VerbatimChar"/>
+                <w:sz w:val="16"/>
+                <w:szCs w:val="16"/>
+              </w:rPr>
+              <w:t xml:space="preserve">/privacy</w:t>
+            </w:r>
+            <w:r>
+              <w:t xml:space="preserve">), terms of service (</w:t>
+            </w:r>
+            <w:r>
+              <w:rPr>
+                <w:rStyle w:val="VerbatimChar"/>
+                <w:sz w:val="16"/>
+                <w:szCs w:val="16"/>
+              </w:rPr>
+              <w:t xml:space="preserve">/terms</w:t>
+            </w:r>
+            <w:r>
+              <w:t xml:space="preserve">) and data-deletion instructions (</w:t>
+            </w:r>
+            <w:r>
+              <w:rPr>
+                <w:rStyle w:val="VerbatimChar"/>
+                <w:sz w:val="16"/>
+                <w:szCs w:val="16"/>
+              </w:rPr>
+              <w:t xml:space="preserve">/data-deletion</w:t>
+            </w:r>
+            <w:r>
+              <w:t xml:space="preserve">), linked from every page's footer, using the business name and contact email set by the owner.</w:t>
+            </w:r>
+          </w:p>
+        </w:tc>
+        <w:tc>
+          <w:tcPr>
+            <w:tcW w:w="605" w:type="dxa"/>
+          </w:tcPr>
+          <w:p>
+            <w:pPr>
+              <w:pStyle w:val="Compact"/>
+              <w:jc w:val="left"/>
+            </w:pPr>
+            <w:r>
+              <w:t xml:space="preserve">M</w:t>
+            </w:r>
+          </w:p>
+        </w:tc>
+        <w:tc>
+          <w:tcPr>
+            <w:tcW w:w="2339" w:type="dxa"/>
+          </w:tcPr>
+          <w:p>
+            <w:pPr>
+              <w:pStyle w:val="Compact"/>
+              <w:jc w:val="left"/>
+            </w:pPr>
+            <w:r>
+              <w:t xml:space="preserve">E2E "the privacy policy, terms and data-deletion pages"</w:t>
+            </w:r>
+          </w:p>
+        </w:tc>
+      </w:tr>
+      <w:tr>
+        <w:trPr>
+          <w:cantSplit/>
+        </w:trPr>
+        <w:tc>
+          <w:tcPr>
+            <w:tcW w:w="1295" w:type="dxa"/>
+          </w:tcPr>
+          <w:p>
+            <w:pPr>
+              <w:pStyle w:val="Compact"/>
+              <w:jc w:val="left"/>
+            </w:pPr>
+            <w:r>
+              <w:t xml:space="preserve">FR-ACC-17</w:t>
+            </w:r>
+          </w:p>
+        </w:tc>
+        <w:tc>
+          <w:tcPr>
+            <w:tcW w:w="5121" w:type="dxa"/>
+          </w:tcPr>
+          <w:p>
+            <w:pPr>
+              <w:pStyle w:val="Compact"/>
+              <w:jc w:val="left"/>
+            </w:pPr>
+            <w:r>
+              <w:t xml:space="preserve">A customer whose account was made with Google, Facebook or Apple and who has not chosen a password shall be able to delete their account by typing DELETE while signed in; a customer with a password shall be asked for it.</w:t>
+            </w:r>
+          </w:p>
+        </w:tc>
+        <w:tc>
+          <w:tcPr>
+            <w:tcW w:w="605" w:type="dxa"/>
+          </w:tcPr>
+          <w:p>
+            <w:pPr>
+              <w:pStyle w:val="Compact"/>
+              <w:jc w:val="left"/>
+            </w:pPr>
+            <w:r>
+              <w:t xml:space="preserve">M</w:t>
+            </w:r>
+          </w:p>
+        </w:tc>
+        <w:tc>
+          <w:tcPr>
+            <w:tcW w:w="2339" w:type="dxa"/>
+          </w:tcPr>
+          <w:p>
+            <w:pPr>
+              <w:pStyle w:val="Compact"/>
+              <w:jc w:val="left"/>
+            </w:pPr>
+            <w:r>
+              <w:rPr>
+                <w:rStyle w:val="VerbatimChar"/>
+                <w:sz w:val="16"/>
+                <w:szCs w:val="16"/>
+              </w:rPr>
+              <w:t xml:space="preserve">social.test.ts</w:t>
+            </w:r>
+          </w:p>
+        </w:tc>
+      </w:tr>
+      <w:tr>
+        <w:trPr>
+          <w:cantSplit/>
+        </w:trPr>
+        <w:tc>
+          <w:tcPr>
+            <w:tcW w:w="1295" w:type="dxa"/>
+          </w:tcPr>
+          <w:p>
+            <w:pPr>
+              <w:pStyle w:val="Compact"/>
+              <w:jc w:val="left"/>
+            </w:pPr>
+            <w:r>
               <w:t xml:space="preserve">FR-ACC-10</w:t>
             </w:r>
           </w:p>
         </w:tc>
         <w:tc>
           <w:tcPr>
-            <w:tcW w:w="5154" w:type="dxa"/>
+            <w:tcW w:w="5121" w:type="dxa"/>
           </w:tcPr>
           <w:p>
             <w:pPr>
@@ -7193,7 +7767,7 @@
         </w:tc>
         <w:tc>
           <w:tcPr>
-            <w:tcW w:w="2306" w:type="dxa"/>
+            <w:tcW w:w="2339" w:type="dxa"/>
           </w:tcPr>
           <w:p>
             <w:pPr>
@@ -7226,7 +7800,7 @@
         </w:tc>
         <w:tc>
           <w:tcPr>
-            <w:tcW w:w="5154" w:type="dxa"/>
+            <w:tcW w:w="5121" w:type="dxa"/>
           </w:tcPr>
           <w:p>
             <w:pPr>
@@ -7254,7 +7828,7 @@
         </w:tc>
         <w:tc>
           <w:tcPr>
-            <w:tcW w:w="2306" w:type="dxa"/>
+            <w:tcW w:w="2339" w:type="dxa"/>
           </w:tcPr>
           <w:p>
             <w:pPr>
@@ -10203,9 +10777,9 @@
       </w:tblPr>
       <w:tblGrid>
         <w:gridCol w:w="1295"/>
-        <w:gridCol w:w="5430"/>
+        <w:gridCol w:w="5332"/>
         <w:gridCol w:w="605"/>
-        <w:gridCol w:w="2030"/>
+        <w:gridCol w:w="2128"/>
       </w:tblGrid>
       <w:tr>
         <w:trPr>
@@ -10230,7 +10804,7 @@
         </w:tc>
         <w:tc>
           <w:tcPr>
-            <w:tcW w:w="5430" w:type="dxa"/>
+            <w:tcW w:w="5332" w:type="dxa"/>
           </w:tcPr>
           <w:p>
             <w:pPr>
@@ -10258,7 +10832,7 @@
         </w:tc>
         <w:tc>
           <w:tcPr>
-            <w:tcW w:w="2030" w:type="dxa"/>
+            <w:tcW w:w="2128" w:type="dxa"/>
           </w:tcPr>
           <w:p>
             <w:pPr>
@@ -10291,7 +10865,7 @@
         </w:tc>
         <w:tc>
           <w:tcPr>
-            <w:tcW w:w="5430" w:type="dxa"/>
+            <w:tcW w:w="5332" w:type="dxa"/>
           </w:tcPr>
           <w:p>
             <w:pPr>
@@ -10319,7 +10893,7 @@
         </w:tc>
         <w:tc>
           <w:tcPr>
-            <w:tcW w:w="2030" w:type="dxa"/>
+            <w:tcW w:w="2128" w:type="dxa"/>
           </w:tcPr>
           <w:p>
             <w:pPr>
@@ -10352,7 +10926,7 @@
         </w:tc>
         <w:tc>
           <w:tcPr>
-            <w:tcW w:w="5430" w:type="dxa"/>
+            <w:tcW w:w="5332" w:type="dxa"/>
           </w:tcPr>
           <w:p>
             <w:pPr>
@@ -10397,7 +10971,7 @@
         </w:tc>
         <w:tc>
           <w:tcPr>
-            <w:tcW w:w="2030" w:type="dxa"/>
+            <w:tcW w:w="2128" w:type="dxa"/>
           </w:tcPr>
           <w:p>
             <w:pPr>
@@ -10438,7 +11012,7 @@
         </w:tc>
         <w:tc>
           <w:tcPr>
-            <w:tcW w:w="5430" w:type="dxa"/>
+            <w:tcW w:w="5332" w:type="dxa"/>
           </w:tcPr>
           <w:p>
             <w:pPr>
@@ -10466,7 +11040,7 @@
         </w:tc>
         <w:tc>
           <w:tcPr>
-            <w:tcW w:w="2030" w:type="dxa"/>
+            <w:tcW w:w="2128" w:type="dxa"/>
           </w:tcPr>
           <w:p>
             <w:pPr>
@@ -10507,7 +11081,7 @@
         </w:tc>
         <w:tc>
           <w:tcPr>
-            <w:tcW w:w="5430" w:type="dxa"/>
+            <w:tcW w:w="5332" w:type="dxa"/>
           </w:tcPr>
           <w:p>
             <w:pPr>
@@ -10551,7 +11125,7 @@
         </w:tc>
         <w:tc>
           <w:tcPr>
-            <w:tcW w:w="2030" w:type="dxa"/>
+            <w:tcW w:w="2128" w:type="dxa"/>
           </w:tcPr>
           <w:p>
             <w:pPr>
@@ -10592,7 +11166,7 @@
         </w:tc>
         <w:tc>
           <w:tcPr>
-            <w:tcW w:w="5430" w:type="dxa"/>
+            <w:tcW w:w="5332" w:type="dxa"/>
           </w:tcPr>
           <w:p>
             <w:pPr>
@@ -10633,7 +11207,7 @@
         </w:tc>
         <w:tc>
           <w:tcPr>
-            <w:tcW w:w="2030" w:type="dxa"/>
+            <w:tcW w:w="2128" w:type="dxa"/>
           </w:tcPr>
           <w:p>
             <w:pPr>
@@ -10671,7 +11245,7 @@
         </w:tc>
         <w:tc>
           <w:tcPr>
-            <w:tcW w:w="5430" w:type="dxa"/>
+            <w:tcW w:w="5332" w:type="dxa"/>
           </w:tcPr>
           <w:p>
             <w:pPr>
@@ -10699,7 +11273,7 @@
         </w:tc>
         <w:tc>
           <w:tcPr>
-            <w:tcW w:w="2030" w:type="dxa"/>
+            <w:tcW w:w="2128" w:type="dxa"/>
           </w:tcPr>
           <w:p>
             <w:pPr>
@@ -10737,7 +11311,7 @@
         </w:tc>
         <w:tc>
           <w:tcPr>
-            <w:tcW w:w="5430" w:type="dxa"/>
+            <w:tcW w:w="5332" w:type="dxa"/>
           </w:tcPr>
           <w:p>
             <w:pPr>
@@ -10765,7 +11339,7 @@
         </w:tc>
         <w:tc>
           <w:tcPr>
-            <w:tcW w:w="2030" w:type="dxa"/>
+            <w:tcW w:w="2128" w:type="dxa"/>
           </w:tcPr>
           <w:p>
             <w:pPr>
@@ -10806,7 +11380,7 @@
         </w:tc>
         <w:tc>
           <w:tcPr>
-            <w:tcW w:w="5430" w:type="dxa"/>
+            <w:tcW w:w="5332" w:type="dxa"/>
           </w:tcPr>
           <w:p>
             <w:pPr>
@@ -10834,7 +11408,7 @@
         </w:tc>
         <w:tc>
           <w:tcPr>
-            <w:tcW w:w="2030" w:type="dxa"/>
+            <w:tcW w:w="2128" w:type="dxa"/>
           </w:tcPr>
           <w:p>
             <w:pPr>
@@ -10867,7 +11441,7 @@
         </w:tc>
         <w:tc>
           <w:tcPr>
-            <w:tcW w:w="5430" w:type="dxa"/>
+            <w:tcW w:w="5332" w:type="dxa"/>
           </w:tcPr>
           <w:p>
             <w:pPr>
@@ -10895,7 +11469,7 @@
         </w:tc>
         <w:tc>
           <w:tcPr>
-            <w:tcW w:w="2030" w:type="dxa"/>
+            <w:tcW w:w="2128" w:type="dxa"/>
           </w:tcPr>
           <w:p>
             <w:pPr>
@@ -10928,7 +11502,7 @@
         </w:tc>
         <w:tc>
           <w:tcPr>
-            <w:tcW w:w="5430" w:type="dxa"/>
+            <w:tcW w:w="5332" w:type="dxa"/>
           </w:tcPr>
           <w:p>
             <w:pPr>
@@ -10956,7 +11530,7 @@
         </w:tc>
         <w:tc>
           <w:tcPr>
-            <w:tcW w:w="2030" w:type="dxa"/>
+            <w:tcW w:w="2128" w:type="dxa"/>
           </w:tcPr>
           <w:p>
             <w:pPr>
@@ -10989,7 +11563,7 @@
         </w:tc>
         <w:tc>
           <w:tcPr>
-            <w:tcW w:w="5430" w:type="dxa"/>
+            <w:tcW w:w="5332" w:type="dxa"/>
           </w:tcPr>
           <w:p>
             <w:pPr>
@@ -11017,7 +11591,7 @@
         </w:tc>
         <w:tc>
           <w:tcPr>
-            <w:tcW w:w="2030" w:type="dxa"/>
+            <w:tcW w:w="2128" w:type="dxa"/>
           </w:tcPr>
           <w:p>
             <w:pPr>
@@ -11026,6 +11600,294 @@
             </w:pPr>
             <w:r>
               <w:t xml:space="preserve">–</w:t>
+            </w:r>
+          </w:p>
+        </w:tc>
+      </w:tr>
+      <w:tr>
+        <w:trPr>
+          <w:cantSplit/>
+        </w:trPr>
+        <w:tc>
+          <w:tcPr>
+            <w:tcW w:w="1295" w:type="dxa"/>
+          </w:tcPr>
+          <w:p>
+            <w:pPr>
+              <w:pStyle w:val="Compact"/>
+              <w:jc w:val="left"/>
+            </w:pPr>
+            <w:r>
+              <w:t xml:space="preserve">FR-LNK-12</w:t>
+            </w:r>
+          </w:p>
+        </w:tc>
+        <w:tc>
+          <w:tcPr>
+            <w:tcW w:w="5332" w:type="dxa"/>
+          </w:tcPr>
+          <w:p>
+            <w:pPr>
+              <w:pStyle w:val="Compact"/>
+              <w:jc w:val="left"/>
+            </w:pPr>
+            <w:r>
+              <w:t xml:space="preserve">The system shall recognise Amazon product links (including short links and shared text) by their ASIN, turn an Amazon UK link into its clean</w:t>
+            </w:r>
+            <w:r>
+              <w:t xml:space="preserve"> </w:t>
+            </w:r>
+            <w:r>
+              <w:rPr>
+                <w:rStyle w:val="VerbatimChar"/>
+                <w:sz w:val="16"/>
+                <w:szCs w:val="16"/>
+              </w:rPr>
+              <w:t xml:space="preserve">amazon.co.uk/dp/ASIN</w:t>
+            </w:r>
+            <w:r>
+              <w:t xml:space="preserve"> </w:t>
+            </w:r>
+            <w:r>
+              <w:t xml:space="preserve">form, and refuse other Amazon stores with a message offering the UK link. The shop shall never request an Amazon page itself; the customer reads the price on Amazon and types it, and staff verify before buying.</w:t>
+            </w:r>
+          </w:p>
+        </w:tc>
+        <w:tc>
+          <w:tcPr>
+            <w:tcW w:w="605" w:type="dxa"/>
+          </w:tcPr>
+          <w:p>
+            <w:pPr>
+              <w:pStyle w:val="Compact"/>
+              <w:jc w:val="left"/>
+            </w:pPr>
+            <w:r>
+              <w:t xml:space="preserve">S</w:t>
+            </w:r>
+          </w:p>
+        </w:tc>
+        <w:tc>
+          <w:tcPr>
+            <w:tcW w:w="2128" w:type="dxa"/>
+          </w:tcPr>
+          <w:p>
+            <w:pPr>
+              <w:pStyle w:val="Compact"/>
+              <w:jc w:val="left"/>
+            </w:pPr>
+            <w:r>
+              <w:rPr>
+                <w:rStyle w:val="VerbatimChar"/>
+                <w:sz w:val="16"/>
+                <w:szCs w:val="16"/>
+              </w:rPr>
+              <w:t xml:space="preserve">amazon-links.test.ts</w:t>
+            </w:r>
+            <w:r>
+              <w:t xml:space="preserve">; E2E "ordering from Amazon UK…"</w:t>
+            </w:r>
+          </w:p>
+        </w:tc>
+      </w:tr>
+      <w:tr>
+        <w:trPr>
+          <w:cantSplit/>
+        </w:trPr>
+        <w:tc>
+          <w:tcPr>
+            <w:tcW w:w="1295" w:type="dxa"/>
+          </w:tcPr>
+          <w:p>
+            <w:pPr>
+              <w:pStyle w:val="Compact"/>
+              <w:jc w:val="left"/>
+            </w:pPr>
+            <w:r>
+              <w:t xml:space="preserve">FR-LNK-13</w:t>
+            </w:r>
+          </w:p>
+        </w:tc>
+        <w:tc>
+          <w:tcPr>
+            <w:tcW w:w="5332" w:type="dxa"/>
+          </w:tcPr>
+          <w:p>
+            <w:pPr>
+              <w:pStyle w:val="Compact"/>
+              <w:jc w:val="left"/>
+            </w:pPr>
+            <w:r>
+              <w:t xml:space="preserve">The search page shall offer a hand-off to Amazon UK's own search for the same words, and an Amazon page (</w:t>
+            </w:r>
+            <w:r>
+              <w:rPr>
+                <w:rStyle w:val="VerbatimChar"/>
+                <w:sz w:val="16"/>
+                <w:szCs w:val="16"/>
+              </w:rPr>
+              <w:t xml:space="preserve">/amazon</w:t>
+            </w:r>
+            <w:r>
+              <w:t xml:space="preserve">) shall explain the steps and offer a one-click bookmarklet that opens the request form pre-filled from the page the customer is viewing.</w:t>
+            </w:r>
+          </w:p>
+        </w:tc>
+        <w:tc>
+          <w:tcPr>
+            <w:tcW w:w="605" w:type="dxa"/>
+          </w:tcPr>
+          <w:p>
+            <w:pPr>
+              <w:pStyle w:val="Compact"/>
+              <w:jc w:val="left"/>
+            </w:pPr>
+            <w:r>
+              <w:t xml:space="preserve">S</w:t>
+            </w:r>
+          </w:p>
+        </w:tc>
+        <w:tc>
+          <w:tcPr>
+            <w:tcW w:w="2128" w:type="dxa"/>
+          </w:tcPr>
+          <w:p>
+            <w:pPr>
+              <w:pStyle w:val="Compact"/>
+              <w:jc w:val="left"/>
+            </w:pPr>
+            <w:r>
+              <w:t xml:space="preserve">E2E</w:t>
+            </w:r>
+          </w:p>
+        </w:tc>
+      </w:tr>
+      <w:tr>
+        <w:trPr>
+          <w:cantSplit/>
+        </w:trPr>
+        <w:tc>
+          <w:tcPr>
+            <w:tcW w:w="1295" w:type="dxa"/>
+          </w:tcPr>
+          <w:p>
+            <w:pPr>
+              <w:pStyle w:val="Compact"/>
+              <w:jc w:val="left"/>
+            </w:pPr>
+            <w:r>
+              <w:t xml:space="preserve">FR-LNK-14</w:t>
+            </w:r>
+          </w:p>
+        </w:tc>
+        <w:tc>
+          <w:tcPr>
+            <w:tcW w:w="5332" w:type="dxa"/>
+          </w:tcPr>
+          <w:p>
+            <w:pPr>
+              <w:pStyle w:val="Compact"/>
+              <w:jc w:val="left"/>
+            </w:pPr>
+            <w:r>
+              <w:t xml:space="preserve">The shop shall be installable as a phone app and appear in the phone's Share menu (web app manifest with a share target), so a customer can share an Amazon product from the Amazon app straight into a request.</w:t>
+            </w:r>
+          </w:p>
+        </w:tc>
+        <w:tc>
+          <w:tcPr>
+            <w:tcW w:w="605" w:type="dxa"/>
+          </w:tcPr>
+          <w:p>
+            <w:pPr>
+              <w:pStyle w:val="Compact"/>
+              <w:jc w:val="left"/>
+            </w:pPr>
+            <w:r>
+              <w:t xml:space="preserve">C</w:t>
+            </w:r>
+          </w:p>
+        </w:tc>
+        <w:tc>
+          <w:tcPr>
+            <w:tcW w:w="2128" w:type="dxa"/>
+          </w:tcPr>
+          <w:p>
+            <w:pPr>
+              <w:pStyle w:val="Compact"/>
+              <w:jc w:val="left"/>
+            </w:pPr>
+            <w:r>
+              <w:t xml:space="preserve">E2E</w:t>
+            </w:r>
+          </w:p>
+        </w:tc>
+      </w:tr>
+      <w:tr>
+        <w:trPr>
+          <w:cantSplit/>
+        </w:trPr>
+        <w:tc>
+          <w:tcPr>
+            <w:tcW w:w="1295" w:type="dxa"/>
+          </w:tcPr>
+          <w:p>
+            <w:pPr>
+              <w:pStyle w:val="Compact"/>
+              <w:jc w:val="left"/>
+            </w:pPr>
+            <w:r>
+              <w:t xml:space="preserve">FR-LNK-15</w:t>
+            </w:r>
+          </w:p>
+        </w:tc>
+        <w:tc>
+          <w:tcPr>
+            <w:tcW w:w="5332" w:type="dxa"/>
+          </w:tcPr>
+          <w:p>
+            <w:pPr>
+              <w:pStyle w:val="Compact"/>
+              <w:jc w:val="left"/>
+            </w:pPr>
+            <w:r>
+              <w:t xml:space="preserve">A customer shall be able to request an item by describing it (at least 3 characters) without a link. Such a request shall never be quoted automatically; staff shall be offered searches for it and can attach the link they find when quoting.</w:t>
+            </w:r>
+          </w:p>
+        </w:tc>
+        <w:tc>
+          <w:tcPr>
+            <w:tcW w:w="605" w:type="dxa"/>
+          </w:tcPr>
+          <w:p>
+            <w:pPr>
+              <w:pStyle w:val="Compact"/>
+              <w:jc w:val="left"/>
+            </w:pPr>
+            <w:r>
+              <w:t xml:space="preserve">S</w:t>
+            </w:r>
+          </w:p>
+        </w:tc>
+        <w:tc>
+          <w:tcPr>
+            <w:tcW w:w="2128" w:type="dxa"/>
+          </w:tcPr>
+          <w:p>
+            <w:pPr>
+              <w:pStyle w:val="Compact"/>
+              <w:jc w:val="left"/>
+            </w:pPr>
+            <w:r>
+              <w:rPr>
+                <w:rStyle w:val="VerbatimChar"/>
+                <w:sz w:val="16"/>
+                <w:szCs w:val="16"/>
+              </w:rPr>
+              <w:t xml:space="preserve">link-submit.test.ts</w:t>
+            </w:r>
+            <w:r>
+              <w:t xml:space="preserve">; E2E "an item described in words…"</w:t>
             </w:r>
           </w:p>
         </w:tc>
@@ -11051,9 +11913,9 @@
       </w:tblPr>
       <w:tblGrid>
         <w:gridCol w:w="1295"/>
-        <w:gridCol w:w="5221"/>
+        <w:gridCol w:w="5120"/>
         <w:gridCol w:w="605"/>
-        <w:gridCol w:w="2239"/>
+        <w:gridCol w:w="2340"/>
       </w:tblGrid>
       <w:tr>
         <w:trPr>
@@ -11078,7 +11940,7 @@
         </w:tc>
         <w:tc>
           <w:tcPr>
-            <w:tcW w:w="5221" w:type="dxa"/>
+            <w:tcW w:w="5120" w:type="dxa"/>
           </w:tcPr>
           <w:p>
             <w:pPr>
@@ -11106,7 +11968,7 @@
         </w:tc>
         <w:tc>
           <w:tcPr>
-            <w:tcW w:w="2239" w:type="dxa"/>
+            <w:tcW w:w="2340" w:type="dxa"/>
           </w:tcPr>
           <w:p>
             <w:pPr>
@@ -11139,7 +12001,7 @@
         </w:tc>
         <w:tc>
           <w:tcPr>
-            <w:tcW w:w="5221" w:type="dxa"/>
+            <w:tcW w:w="5120" w:type="dxa"/>
           </w:tcPr>
           <w:p>
             <w:pPr>
@@ -11167,7 +12029,7 @@
         </w:tc>
         <w:tc>
           <w:tcPr>
-            <w:tcW w:w="2239" w:type="dxa"/>
+            <w:tcW w:w="2340" w:type="dxa"/>
           </w:tcPr>
           <w:p>
             <w:pPr>
@@ -11222,7 +12084,7 @@
         </w:tc>
         <w:tc>
           <w:tcPr>
-            <w:tcW w:w="5221" w:type="dxa"/>
+            <w:tcW w:w="5120" w:type="dxa"/>
           </w:tcPr>
           <w:p>
             <w:pPr>
@@ -11250,7 +12112,7 @@
         </w:tc>
         <w:tc>
           <w:tcPr>
-            <w:tcW w:w="2239" w:type="dxa"/>
+            <w:tcW w:w="2340" w:type="dxa"/>
           </w:tcPr>
           <w:p>
             <w:pPr>
@@ -11291,7 +12153,7 @@
         </w:tc>
         <w:tc>
           <w:tcPr>
-            <w:tcW w:w="5221" w:type="dxa"/>
+            <w:tcW w:w="5120" w:type="dxa"/>
           </w:tcPr>
           <w:p>
             <w:pPr>
@@ -11336,7 +12198,7 @@
         </w:tc>
         <w:tc>
           <w:tcPr>
-            <w:tcW w:w="2239" w:type="dxa"/>
+            <w:tcW w:w="2340" w:type="dxa"/>
           </w:tcPr>
           <w:p>
             <w:pPr>
@@ -11377,7 +12239,7 @@
         </w:tc>
         <w:tc>
           <w:tcPr>
-            <w:tcW w:w="5221" w:type="dxa"/>
+            <w:tcW w:w="5120" w:type="dxa"/>
           </w:tcPr>
           <w:p>
             <w:pPr>
@@ -11418,7 +12280,7 @@
         </w:tc>
         <w:tc>
           <w:tcPr>
-            <w:tcW w:w="2239" w:type="dxa"/>
+            <w:tcW w:w="2340" w:type="dxa"/>
           </w:tcPr>
           <w:p>
             <w:pPr>
@@ -11456,15 +12318,15 @@
         </w:tc>
         <w:tc>
           <w:tcPr>
-            <w:tcW w:w="5221" w:type="dxa"/>
-          </w:tcPr>
-          <w:p>
-            <w:pPr>
-              <w:pStyle w:val="Compact"/>
-              <w:jc w:val="left"/>
-            </w:pPr>
-            <w:r>
-              <w:t xml:space="preserve">The system shall support catalogue sources of these kinds: product feed (CSV/JSON), eBay API, Shopify shop, shop website (sitemap and product pages), file import, pasted links.</w:t>
+            <w:tcW w:w="5120" w:type="dxa"/>
+          </w:tcPr>
+          <w:p>
+            <w:pPr>
+              <w:pStyle w:val="Compact"/>
+              <w:jc w:val="left"/>
+            </w:pPr>
+            <w:r>
+              <w:t xml:space="preserve">The system shall support catalogue sources of these kinds: product feed (CSV/JSON), eBay API, Diffbot Product API, Shopify shop, WooCommerce shop, shop website (sitemap and product pages), file import, pasted links.</w:t>
             </w:r>
           </w:p>
         </w:tc>
@@ -11484,7 +12346,7 @@
         </w:tc>
         <w:tc>
           <w:tcPr>
-            <w:tcW w:w="2239" w:type="dxa"/>
+            <w:tcW w:w="2340" w:type="dxa"/>
           </w:tcPr>
           <w:p>
             <w:pPr>
@@ -11539,76 +12401,21 @@
                 <w:sz w:val="16"/>
                 <w:szCs w:val="16"/>
               </w:rPr>
-              <w:t xml:space="preserve">file-import.test.ts</w:t>
-            </w:r>
-          </w:p>
-        </w:tc>
-      </w:tr>
-      <w:tr>
-        <w:trPr>
-          <w:cantSplit/>
-        </w:trPr>
-        <w:tc>
-          <w:tcPr>
-            <w:tcW w:w="1295" w:type="dxa"/>
-          </w:tcPr>
-          <w:p>
-            <w:pPr>
-              <w:pStyle w:val="Compact"/>
-              <w:jc w:val="left"/>
-            </w:pPr>
-            <w:r>
-              <w:t xml:space="preserve">FR-CAT-11</w:t>
-            </w:r>
-          </w:p>
-        </w:tc>
-        <w:tc>
-          <w:tcPr>
-            <w:tcW w:w="5221" w:type="dxa"/>
-          </w:tcPr>
-          <w:p>
-            <w:pPr>
-              <w:pStyle w:val="Compact"/>
-              <w:jc w:val="left"/>
-            </w:pPr>
-            <w:r>
-              <w:t xml:space="preserve">A source shall not be switched on until staff confirm they have checked the shop's terms or hold a licence.</w:t>
-            </w:r>
-          </w:p>
-        </w:tc>
-        <w:tc>
-          <w:tcPr>
-            <w:tcW w:w="605" w:type="dxa"/>
-          </w:tcPr>
-          <w:p>
-            <w:pPr>
-              <w:pStyle w:val="Compact"/>
-              <w:jc w:val="left"/>
-            </w:pPr>
-            <w:r>
-              <w:t xml:space="preserve">M</w:t>
-            </w:r>
-          </w:p>
-        </w:tc>
-        <w:tc>
-          <w:tcPr>
-            <w:tcW w:w="2239" w:type="dxa"/>
-          </w:tcPr>
-          <w:p>
-            <w:pPr>
-              <w:pStyle w:val="Compact"/>
-              <w:jc w:val="left"/>
-            </w:pPr>
+              <w:t xml:space="preserve">woocommerce.test.ts</w:t>
+            </w:r>
+            <w:r>
+              <w:t xml:space="preserve">,</w:t>
+            </w:r>
+            <w:r>
+              <w:t xml:space="preserve"> </w:t>
+            </w:r>
             <w:r>
               <w:rPr>
                 <w:rStyle w:val="VerbatimChar"/>
                 <w:sz w:val="16"/>
                 <w:szCs w:val="16"/>
               </w:rPr>
-              <w:t xml:space="preserve">run.test.ts</w:t>
-            </w:r>
-            <w:r>
-              <w:t xml:space="preserve">; E2E "sources need confirmed permission"</w:t>
+              <w:t xml:space="preserve">file-import.test.ts</w:t>
             </w:r>
           </w:p>
         </w:tc>
@@ -11627,21 +12434,21 @@
               <w:jc w:val="left"/>
             </w:pPr>
             <w:r>
-              <w:t xml:space="preserve">FR-CAT-12</w:t>
-            </w:r>
-          </w:p>
-        </w:tc>
-        <w:tc>
-          <w:tcPr>
-            <w:tcW w:w="5221" w:type="dxa"/>
-          </w:tcPr>
-          <w:p>
-            <w:pPr>
-              <w:pStyle w:val="Compact"/>
-              <w:jc w:val="left"/>
-            </w:pPr>
-            <w:r>
-              <w:t xml:space="preserve">Staff shall be able to preview a source without saving, run it now, switch it on or off, set its schedule and rules, and remove it keeping or removing its products.</w:t>
+              <w:t xml:space="preserve">FR-CAT-11</w:t>
+            </w:r>
+          </w:p>
+        </w:tc>
+        <w:tc>
+          <w:tcPr>
+            <w:tcW w:w="5120" w:type="dxa"/>
+          </w:tcPr>
+          <w:p>
+            <w:pPr>
+              <w:pStyle w:val="Compact"/>
+              <w:jc w:val="left"/>
+            </w:pPr>
+            <w:r>
+              <w:t xml:space="preserve">A source shall not be switched on until staff confirm they have checked the shop's terms or hold a licence.</w:t>
             </w:r>
           </w:p>
         </w:tc>
@@ -11661,7 +12468,7 @@
         </w:tc>
         <w:tc>
           <w:tcPr>
-            <w:tcW w:w="2239" w:type="dxa"/>
+            <w:tcW w:w="2340" w:type="dxa"/>
           </w:tcPr>
           <w:p>
             <w:pPr>
@@ -11677,7 +12484,7 @@
               <w:t xml:space="preserve">run.test.ts</w:t>
             </w:r>
             <w:r>
-              <w:t xml:space="preserve">; E2E</w:t>
+              <w:t xml:space="preserve">; E2E "sources need confirmed permission"</w:t>
             </w:r>
           </w:p>
         </w:tc>
@@ -11696,21 +12503,21 @@
               <w:jc w:val="left"/>
             </w:pPr>
             <w:r>
-              <w:t xml:space="preserve">FR-CAT-13</w:t>
-            </w:r>
-          </w:p>
-        </w:tc>
-        <w:tc>
-          <w:tcPr>
-            <w:tcW w:w="5221" w:type="dxa"/>
-          </w:tcPr>
-          <w:p>
-            <w:pPr>
-              <w:pStyle w:val="Compact"/>
-              <w:jc w:val="left"/>
-            </w:pPr>
-            <w:r>
-              <w:t xml:space="preserve">The system shall run due sources automatically (built-in scheduler, 10-minute tick; each source default every 24 hours) or via an external cron endpoint.</w:t>
+              <w:t xml:space="preserve">FR-CAT-12</w:t>
+            </w:r>
+          </w:p>
+        </w:tc>
+        <w:tc>
+          <w:tcPr>
+            <w:tcW w:w="5120" w:type="dxa"/>
+          </w:tcPr>
+          <w:p>
+            <w:pPr>
+              <w:pStyle w:val="Compact"/>
+              <w:jc w:val="left"/>
+            </w:pPr>
+            <w:r>
+              <w:t xml:space="preserve">Staff shall be able to preview a source without saving, run it now, switch it on or off, set its schedule and rules, and remove it keeping or removing its products.</w:t>
             </w:r>
           </w:p>
         </w:tc>
@@ -11730,7 +12537,7 @@
         </w:tc>
         <w:tc>
           <w:tcPr>
-            <w:tcW w:w="2239" w:type="dxa"/>
+            <w:tcW w:w="2340" w:type="dxa"/>
           </w:tcPr>
           <w:p>
             <w:pPr>
@@ -11746,10 +12553,7 @@
               <w:t xml:space="preserve">run.test.ts</w:t>
             </w:r>
             <w:r>
-              <w:t xml:space="preserve"> </w:t>
-            </w:r>
-            <w:r>
-              <w:t xml:space="preserve">(due sources); inspection</w:t>
+              <w:t xml:space="preserve">; E2E</w:t>
             </w:r>
           </w:p>
         </w:tc>
@@ -11768,21 +12572,21 @@
               <w:jc w:val="left"/>
             </w:pPr>
             <w:r>
-              <w:t xml:space="preserve">FR-CAT-14</w:t>
-            </w:r>
-          </w:p>
-        </w:tc>
-        <w:tc>
-          <w:tcPr>
-            <w:tcW w:w="5221" w:type="dxa"/>
-          </w:tcPr>
-          <w:p>
-            <w:pPr>
-              <w:pStyle w:val="Compact"/>
-              <w:jc w:val="left"/>
-            </w:pPr>
-            <w:r>
-              <w:t xml:space="preserve">New items shall be published automatically unless held; changes of price, was-price, stock or photo shall update live items; items missing from a complete feed shall be hidden only if at least half remain; items not refreshed within the source's stale window (default 14 days) shall be hidden.</w:t>
+              <w:t xml:space="preserve">FR-CAT-13</w:t>
+            </w:r>
+          </w:p>
+        </w:tc>
+        <w:tc>
+          <w:tcPr>
+            <w:tcW w:w="5120" w:type="dxa"/>
+          </w:tcPr>
+          <w:p>
+            <w:pPr>
+              <w:pStyle w:val="Compact"/>
+              <w:jc w:val="left"/>
+            </w:pPr>
+            <w:r>
+              <w:t xml:space="preserve">The system shall run due sources automatically (built-in scheduler, 10-minute tick; each source default every 24 hours) or via an external cron endpoint.</w:t>
             </w:r>
           </w:p>
         </w:tc>
@@ -11802,7 +12606,7 @@
         </w:tc>
         <w:tc>
           <w:tcPr>
-            <w:tcW w:w="2239" w:type="dxa"/>
+            <w:tcW w:w="2340" w:type="dxa"/>
           </w:tcPr>
           <w:p>
             <w:pPr>
@@ -11817,6 +12621,12 @@
               </w:rPr>
               <w:t xml:space="preserve">run.test.ts</w:t>
             </w:r>
+            <w:r>
+              <w:t xml:space="preserve"> </w:t>
+            </w:r>
+            <w:r>
+              <w:t xml:space="preserve">(due sources); inspection</w:t>
+            </w:r>
           </w:p>
         </w:tc>
       </w:tr>
@@ -11834,21 +12644,21 @@
               <w:jc w:val="left"/>
             </w:pPr>
             <w:r>
-              <w:t xml:space="preserve">FR-CAT-15</w:t>
-            </w:r>
-          </w:p>
-        </w:tc>
-        <w:tc>
-          <w:tcPr>
-            <w:tcW w:w="5221" w:type="dxa"/>
-          </w:tcPr>
-          <w:p>
-            <w:pPr>
-              <w:pStyle w:val="Compact"/>
-              <w:jc w:val="left"/>
-            </w:pPr>
-            <w:r>
-              <w:t xml:space="preserve">Items with a price under 50p or over £10,000, a name under 3 characters, no link back, or a price move above the source's limit (default 40%) shall be held for staff review; staff shall be able to approve or reject singly or in bulk.</w:t>
+              <w:t xml:space="preserve">FR-CAT-14</w:t>
+            </w:r>
+          </w:p>
+        </w:tc>
+        <w:tc>
+          <w:tcPr>
+            <w:tcW w:w="5120" w:type="dxa"/>
+          </w:tcPr>
+          <w:p>
+            <w:pPr>
+              <w:pStyle w:val="Compact"/>
+              <w:jc w:val="left"/>
+            </w:pPr>
+            <w:r>
+              <w:t xml:space="preserve">New items shall be published automatically unless held; changes of price, was-price, stock or photo shall update live items; items missing from a complete feed shall be hidden only if at least half remain; items not refreshed within the source's stale window (default 14 days) shall be hidden.</w:t>
             </w:r>
           </w:p>
         </w:tc>
@@ -11868,7 +12678,7 @@
         </w:tc>
         <w:tc>
           <w:tcPr>
-            <w:tcW w:w="2239" w:type="dxa"/>
+            <w:tcW w:w="2340" w:type="dxa"/>
           </w:tcPr>
           <w:p>
             <w:pPr>
@@ -11900,21 +12710,21 @@
               <w:jc w:val="left"/>
             </w:pPr>
             <w:r>
-              <w:t xml:space="preserve">FR-CAT-16</w:t>
-            </w:r>
-          </w:p>
-        </w:tc>
-        <w:tc>
-          <w:tcPr>
-            <w:tcW w:w="5221" w:type="dxa"/>
-          </w:tcPr>
-          <w:p>
-            <w:pPr>
-              <w:pStyle w:val="Compact"/>
-              <w:jc w:val="left"/>
-            </w:pPr>
-            <w:r>
-              <w:t xml:space="preserve">Only prices in pounds shall be accepted.</w:t>
+              <w:t xml:space="preserve">FR-CAT-15</w:t>
+            </w:r>
+          </w:p>
+        </w:tc>
+        <w:tc>
+          <w:tcPr>
+            <w:tcW w:w="5120" w:type="dxa"/>
+          </w:tcPr>
+          <w:p>
+            <w:pPr>
+              <w:pStyle w:val="Compact"/>
+              <w:jc w:val="left"/>
+            </w:pPr>
+            <w:r>
+              <w:t xml:space="preserve">Items with a price under 50p or over £10,000, a name under 3 characters, no link back, or a price move above the source's limit (default 40%) shall be held for staff review; staff shall be able to approve or reject singly or in bulk.</w:t>
             </w:r>
           </w:p>
         </w:tc>
@@ -11934,7 +12744,7 @@
         </w:tc>
         <w:tc>
           <w:tcPr>
-            <w:tcW w:w="2239" w:type="dxa"/>
+            <w:tcW w:w="2340" w:type="dxa"/>
           </w:tcPr>
           <w:p>
             <w:pPr>
@@ -11947,134 +12757,156 @@
                 <w:sz w:val="16"/>
                 <w:szCs w:val="16"/>
               </w:rPr>
-              <w:t xml:space="preserve">parse.test.ts</w:t>
-            </w:r>
-            <w:r>
-              <w:t xml:space="preserve">;</w:t>
-            </w:r>
-            <w:r>
-              <w:t xml:space="preserve"> </w:t>
-            </w:r>
+              <w:t xml:space="preserve">run.test.ts</w:t>
+            </w:r>
+          </w:p>
+        </w:tc>
+      </w:tr>
+      <w:tr>
+        <w:trPr>
+          <w:cantSplit/>
+        </w:trPr>
+        <w:tc>
+          <w:tcPr>
+            <w:tcW w:w="1295" w:type="dxa"/>
+          </w:tcPr>
+          <w:p>
+            <w:pPr>
+              <w:pStyle w:val="Compact"/>
+              <w:jc w:val="left"/>
+            </w:pPr>
+            <w:r>
+              <w:t xml:space="preserve">FR-CAT-16</w:t>
+            </w:r>
+          </w:p>
+        </w:tc>
+        <w:tc>
+          <w:tcPr>
+            <w:tcW w:w="5120" w:type="dxa"/>
+          </w:tcPr>
+          <w:p>
+            <w:pPr>
+              <w:pStyle w:val="Compact"/>
+              <w:jc w:val="left"/>
+            </w:pPr>
+            <w:r>
+              <w:t xml:space="preserve">Only prices in pounds shall be accepted.</w:t>
+            </w:r>
+          </w:p>
+        </w:tc>
+        <w:tc>
+          <w:tcPr>
+            <w:tcW w:w="605" w:type="dxa"/>
+          </w:tcPr>
+          <w:p>
+            <w:pPr>
+              <w:pStyle w:val="Compact"/>
+              <w:jc w:val="left"/>
+            </w:pPr>
+            <w:r>
+              <w:t xml:space="preserve">M</w:t>
+            </w:r>
+          </w:p>
+        </w:tc>
+        <w:tc>
+          <w:tcPr>
+            <w:tcW w:w="2340" w:type="dxa"/>
+          </w:tcPr>
+          <w:p>
+            <w:pPr>
+              <w:pStyle w:val="Compact"/>
+              <w:jc w:val="left"/>
+            </w:pPr>
             <w:r>
               <w:rPr>
                 <w:rStyle w:val="VerbatimChar"/>
                 <w:sz w:val="16"/>
                 <w:szCs w:val="16"/>
               </w:rPr>
-              <w:t xml:space="preserve">shopify.test.ts</w:t>
-            </w:r>
-          </w:p>
-        </w:tc>
-      </w:tr>
-      <w:tr>
-        <w:trPr>
-          <w:cantSplit/>
-        </w:trPr>
-        <w:tc>
-          <w:tcPr>
-            <w:tcW w:w="1295" w:type="dxa"/>
-          </w:tcPr>
-          <w:p>
-            <w:pPr>
-              <w:pStyle w:val="Compact"/>
-              <w:jc w:val="left"/>
-            </w:pPr>
-            <w:r>
-              <w:t xml:space="preserve">FR-CAT-17</w:t>
-            </w:r>
-          </w:p>
-        </w:tc>
-        <w:tc>
-          <w:tcPr>
-            <w:tcW w:w="5221" w:type="dxa"/>
-          </w:tcPr>
-          <w:p>
-            <w:pPr>
-              <w:pStyle w:val="Compact"/>
-              <w:jc w:val="left"/>
-            </w:pPr>
-            <w:r>
-              <w:t xml:space="preserve">Feed addresses (which often hold keys) shall be stored encrypted and shown truncated.</w:t>
-            </w:r>
-          </w:p>
-        </w:tc>
-        <w:tc>
-          <w:tcPr>
-            <w:tcW w:w="605" w:type="dxa"/>
-          </w:tcPr>
-          <w:p>
-            <w:pPr>
-              <w:pStyle w:val="Compact"/>
-              <w:jc w:val="left"/>
-            </w:pPr>
-            <w:r>
-              <w:t xml:space="preserve">M</w:t>
-            </w:r>
-          </w:p>
-        </w:tc>
-        <w:tc>
-          <w:tcPr>
-            <w:tcW w:w="2239" w:type="dxa"/>
-          </w:tcPr>
-          <w:p>
-            <w:pPr>
-              <w:pStyle w:val="Compact"/>
-              <w:jc w:val="left"/>
-            </w:pPr>
+              <w:t xml:space="preserve">parse.test.ts</w:t>
+            </w:r>
+            <w:r>
+              <w:t xml:space="preserve">;</w:t>
+            </w:r>
+            <w:r>
+              <w:t xml:space="preserve"> </w:t>
+            </w:r>
             <w:r>
               <w:rPr>
                 <w:rStyle w:val="VerbatimChar"/>
                 <w:sz w:val="16"/>
                 <w:szCs w:val="16"/>
               </w:rPr>
-              <w:t xml:space="preserve">run.test.ts</w:t>
-            </w:r>
-            <w:r>
-              <w:t xml:space="preserve">;</w:t>
-            </w:r>
-            <w:r>
-              <w:t xml:space="preserve"> </w:t>
-            </w:r>
+              <w:t xml:space="preserve">shopify.test.ts</w:t>
+            </w:r>
+          </w:p>
+        </w:tc>
+      </w:tr>
+      <w:tr>
+        <w:trPr>
+          <w:cantSplit/>
+        </w:trPr>
+        <w:tc>
+          <w:tcPr>
+            <w:tcW w:w="1295" w:type="dxa"/>
+          </w:tcPr>
+          <w:p>
+            <w:pPr>
+              <w:pStyle w:val="Compact"/>
+              <w:jc w:val="left"/>
+            </w:pPr>
+            <w:r>
+              <w:t xml:space="preserve">FR-CAT-17</w:t>
+            </w:r>
+          </w:p>
+        </w:tc>
+        <w:tc>
+          <w:tcPr>
+            <w:tcW w:w="5120" w:type="dxa"/>
+          </w:tcPr>
+          <w:p>
+            <w:pPr>
+              <w:pStyle w:val="Compact"/>
+              <w:jc w:val="left"/>
+            </w:pPr>
+            <w:r>
+              <w:t xml:space="preserve">Feed addresses (which often hold keys) shall be stored encrypted and shown truncated.</w:t>
+            </w:r>
+          </w:p>
+        </w:tc>
+        <w:tc>
+          <w:tcPr>
+            <w:tcW w:w="605" w:type="dxa"/>
+          </w:tcPr>
+          <w:p>
+            <w:pPr>
+              <w:pStyle w:val="Compact"/>
+              <w:jc w:val="left"/>
+            </w:pPr>
+            <w:r>
+              <w:t xml:space="preserve">M</w:t>
+            </w:r>
+          </w:p>
+        </w:tc>
+        <w:tc>
+          <w:tcPr>
+            <w:tcW w:w="2340" w:type="dxa"/>
+          </w:tcPr>
+          <w:p>
+            <w:pPr>
+              <w:pStyle w:val="Compact"/>
+              <w:jc w:val="left"/>
+            </w:pPr>
             <w:r>
               <w:rPr>
                 <w:rStyle w:val="VerbatimChar"/>
                 <w:sz w:val="16"/>
                 <w:szCs w:val="16"/>
               </w:rPr>
-              <w:t xml:space="preserve">secrets.test.ts</w:t>
-            </w:r>
-          </w:p>
-        </w:tc>
-      </w:tr>
-      <w:tr>
-        <w:trPr>
-          <w:cantSplit/>
-        </w:trPr>
-        <w:tc>
-          <w:tcPr>
-            <w:tcW w:w="1295" w:type="dxa"/>
-          </w:tcPr>
-          <w:p>
-            <w:pPr>
-              <w:pStyle w:val="Compact"/>
-              <w:jc w:val="left"/>
-            </w:pPr>
-            <w:r>
-              <w:t xml:space="preserve">FR-CAT-18</w:t>
-            </w:r>
-          </w:p>
-        </w:tc>
-        <w:tc>
-          <w:tcPr>
-            <w:tcW w:w="5221" w:type="dxa"/>
-          </w:tcPr>
-          <w:p>
-            <w:pPr>
-              <w:pStyle w:val="Compact"/>
-              <w:jc w:val="left"/>
-            </w:pPr>
-            <w:r>
-              <w:t xml:space="preserve">A Shopify source shall read the shop's public product list only if</w:t>
+              <w:t xml:space="preserve">run.test.ts</w:t>
+            </w:r>
+            <w:r>
+              <w:t xml:space="preserve">;</w:t>
             </w:r>
             <w:r>
               <w:t xml:space="preserve"> </w:t>
@@ -12085,79 +12917,57 @@
                 <w:sz w:val="16"/>
                 <w:szCs w:val="16"/>
               </w:rPr>
-              <w:t xml:space="preserve">robots.txt</w:t>
+              <w:t xml:space="preserve">secrets.test.ts</w:t>
+            </w:r>
+          </w:p>
+        </w:tc>
+      </w:tr>
+      <w:tr>
+        <w:trPr>
+          <w:cantSplit/>
+        </w:trPr>
+        <w:tc>
+          <w:tcPr>
+            <w:tcW w:w="1295" w:type="dxa"/>
+          </w:tcPr>
+          <w:p>
+            <w:pPr>
+              <w:pStyle w:val="Compact"/>
+              <w:jc w:val="left"/>
+            </w:pPr>
+            <w:r>
+              <w:t xml:space="preserve">FR-CAT-18</w:t>
+            </w:r>
+          </w:p>
+        </w:tc>
+        <w:tc>
+          <w:tcPr>
+            <w:tcW w:w="5120" w:type="dxa"/>
+          </w:tcPr>
+          <w:p>
+            <w:pPr>
+              <w:pStyle w:val="Compact"/>
+              <w:jc w:val="left"/>
+            </w:pPr>
+            <w:r>
+              <w:t xml:space="preserve">A Shopify or WooCommerce source shall read the shop's public product list only if</w:t>
             </w:r>
             <w:r>
               <w:t xml:space="preserve"> </w:t>
             </w:r>
-            <w:r>
-              <w:t xml:space="preserve">allows, the shop's currency is GBP, and the shop is a Shopify shop; sizes and colours shall become item options; products whose variants differ in price shall be skipped.</w:t>
-            </w:r>
-          </w:p>
-        </w:tc>
-        <w:tc>
-          <w:tcPr>
-            <w:tcW w:w="605" w:type="dxa"/>
-          </w:tcPr>
-          <w:p>
-            <w:pPr>
-              <w:pStyle w:val="Compact"/>
-              <w:jc w:val="left"/>
-            </w:pPr>
-            <w:r>
-              <w:t xml:space="preserve">M</w:t>
-            </w:r>
-          </w:p>
-        </w:tc>
-        <w:tc>
-          <w:tcPr>
-            <w:tcW w:w="2239" w:type="dxa"/>
-          </w:tcPr>
-          <w:p>
-            <w:pPr>
-              <w:pStyle w:val="Compact"/>
-              <w:jc w:val="left"/>
-            </w:pPr>
             <w:r>
               <w:rPr>
                 <w:rStyle w:val="VerbatimChar"/>
                 <w:sz w:val="16"/>
                 <w:szCs w:val="16"/>
               </w:rPr>
-              <w:t xml:space="preserve">shopify.test.ts</w:t>
-            </w:r>
-          </w:p>
-        </w:tc>
-      </w:tr>
-      <w:tr>
-        <w:trPr>
-          <w:cantSplit/>
-        </w:trPr>
-        <w:tc>
-          <w:tcPr>
-            <w:tcW w:w="1295" w:type="dxa"/>
-          </w:tcPr>
-          <w:p>
-            <w:pPr>
-              <w:pStyle w:val="Compact"/>
-              <w:jc w:val="left"/>
-            </w:pPr>
-            <w:r>
-              <w:t xml:space="preserve">FR-CAT-19</w:t>
-            </w:r>
-          </w:p>
-        </w:tc>
-        <w:tc>
-          <w:tcPr>
-            <w:tcW w:w="5221" w:type="dxa"/>
-          </w:tcPr>
-          <w:p>
-            <w:pPr>
-              <w:pStyle w:val="Compact"/>
-              <w:jc w:val="left"/>
-            </w:pPr>
-            <w:r>
-              <w:t xml:space="preserve">A file-import source shall accept an uploaded CSV or JSON, apply the same checks as a feed, update on re-upload, and never remove products.</w:t>
+              <w:t xml:space="preserve">robots.txt</w:t>
+            </w:r>
+            <w:r>
+              <w:t xml:space="preserve"> </w:t>
+            </w:r>
+            <w:r>
+              <w:t xml:space="preserve">allows, the shop's currency is GBP, and the shop is a Shopify (or, for WooCommerce, a Store API) shop; sizes and colours shall become item options; products whose variants differ in price shall be skipped.</w:t>
             </w:r>
           </w:p>
         </w:tc>
@@ -12171,13 +12981,13 @@
               <w:jc w:val="left"/>
             </w:pPr>
             <w:r>
-              <w:t xml:space="preserve">S</w:t>
-            </w:r>
-          </w:p>
-        </w:tc>
-        <w:tc>
-          <w:tcPr>
-            <w:tcW w:w="2239" w:type="dxa"/>
+              <w:t xml:space="preserve">M</w:t>
+            </w:r>
+          </w:p>
+        </w:tc>
+        <w:tc>
+          <w:tcPr>
+            <w:tcW w:w="2340" w:type="dxa"/>
           </w:tcPr>
           <w:p>
             <w:pPr>
@@ -12190,76 +13000,21 @@
                 <w:sz w:val="16"/>
                 <w:szCs w:val="16"/>
               </w:rPr>
-              <w:t xml:space="preserve">file-import.test.ts</w:t>
-            </w:r>
-            <w:r>
-              <w:t xml:space="preserve">; E2E</w:t>
-            </w:r>
-          </w:p>
-        </w:tc>
-      </w:tr>
-      <w:tr>
-        <w:trPr>
-          <w:cantSplit/>
-        </w:trPr>
-        <w:tc>
-          <w:tcPr>
-            <w:tcW w:w="1295" w:type="dxa"/>
-          </w:tcPr>
-          <w:p>
-            <w:pPr>
-              <w:pStyle w:val="Compact"/>
-              <w:jc w:val="left"/>
-            </w:pPr>
-            <w:r>
-              <w:t xml:space="preserve">FR-CAT-20</w:t>
-            </w:r>
-          </w:p>
-        </w:tc>
-        <w:tc>
-          <w:tcPr>
-            <w:tcW w:w="5221" w:type="dxa"/>
-          </w:tcPr>
-          <w:p>
-            <w:pPr>
-              <w:pStyle w:val="Compact"/>
-              <w:jc w:val="left"/>
-            </w:pPr>
-            <w:r>
-              <w:t xml:space="preserve">An eBay source shall sign in with the admin's keys, search each listed query, accept only new, fixed-price, UK-located GBP listings, and never treat a missing result as removal.</w:t>
-            </w:r>
-          </w:p>
-        </w:tc>
-        <w:tc>
-          <w:tcPr>
-            <w:tcW w:w="605" w:type="dxa"/>
-          </w:tcPr>
-          <w:p>
-            <w:pPr>
-              <w:pStyle w:val="Compact"/>
-              <w:jc w:val="left"/>
-            </w:pPr>
-            <w:r>
-              <w:t xml:space="preserve">M</w:t>
-            </w:r>
-          </w:p>
-        </w:tc>
-        <w:tc>
-          <w:tcPr>
-            <w:tcW w:w="2239" w:type="dxa"/>
-          </w:tcPr>
-          <w:p>
-            <w:pPr>
-              <w:pStyle w:val="Compact"/>
-              <w:jc w:val="left"/>
-            </w:pPr>
+              <w:t xml:space="preserve">shopify.test.ts</w:t>
+            </w:r>
+            <w:r>
+              <w:t xml:space="preserve">,</w:t>
+            </w:r>
+            <w:r>
+              <w:t xml:space="preserve"> </w:t>
+            </w:r>
             <w:r>
               <w:rPr>
                 <w:rStyle w:val="VerbatimChar"/>
                 <w:sz w:val="16"/>
                 <w:szCs w:val="16"/>
               </w:rPr>
-              <w:t xml:space="preserve">ebay.test.ts</w:t>
+              <w:t xml:space="preserve">woocommerce.test.ts</w:t>
             </w:r>
           </w:p>
         </w:tc>
@@ -12278,49 +13033,156 @@
               <w:jc w:val="left"/>
             </w:pPr>
             <w:r>
-              <w:t xml:space="preserve">FR-CAT-30</w:t>
-            </w:r>
-          </w:p>
-        </w:tc>
-        <w:tc>
-          <w:tcPr>
-            <w:tcW w:w="5221" w:type="dxa"/>
-          </w:tcPr>
-          <w:p>
-            <w:pPr>
-              <w:pStyle w:val="Compact"/>
-              <w:jc w:val="left"/>
-            </w:pPr>
-            <w:r>
-              <w:t xml:space="preserve">The importer shall identify itself honestly (</w:t>
-            </w:r>
+              <w:t xml:space="preserve">FR-CAT-19</w:t>
+            </w:r>
+          </w:p>
+        </w:tc>
+        <w:tc>
+          <w:tcPr>
+            <w:tcW w:w="5120" w:type="dxa"/>
+          </w:tcPr>
+          <w:p>
+            <w:pPr>
+              <w:pStyle w:val="Compact"/>
+              <w:jc w:val="left"/>
+            </w:pPr>
+            <w:r>
+              <w:t xml:space="preserve">A file-import source shall accept an uploaded CSV or JSON, apply the same checks as a feed, update on re-upload, and never remove products.</w:t>
+            </w:r>
+          </w:p>
+        </w:tc>
+        <w:tc>
+          <w:tcPr>
+            <w:tcW w:w="605" w:type="dxa"/>
+          </w:tcPr>
+          <w:p>
+            <w:pPr>
+              <w:pStyle w:val="Compact"/>
+              <w:jc w:val="left"/>
+            </w:pPr>
+            <w:r>
+              <w:t xml:space="preserve">S</w:t>
+            </w:r>
+          </w:p>
+        </w:tc>
+        <w:tc>
+          <w:tcPr>
+            <w:tcW w:w="2340" w:type="dxa"/>
+          </w:tcPr>
+          <w:p>
+            <w:pPr>
+              <w:pStyle w:val="Compact"/>
+              <w:jc w:val="left"/>
+            </w:pPr>
             <w:r>
               <w:rPr>
                 <w:rStyle w:val="VerbatimChar"/>
                 <w:sz w:val="16"/>
                 <w:szCs w:val="16"/>
               </w:rPr>
-              <w:t xml:space="preserve">ShopCatalogBot</w:t>
-            </w:r>
-            <w:r>
-              <w:t xml:space="preserve">, with a public explanation page) and obey</w:t>
-            </w:r>
-            <w:r>
-              <w:t xml:space="preserve"> </w:t>
-            </w:r>
+              <w:t xml:space="preserve">file-import.test.ts</w:t>
+            </w:r>
+            <w:r>
+              <w:t xml:space="preserve">; E2E</w:t>
+            </w:r>
+          </w:p>
+        </w:tc>
+      </w:tr>
+      <w:tr>
+        <w:trPr>
+          <w:cantSplit/>
+        </w:trPr>
+        <w:tc>
+          <w:tcPr>
+            <w:tcW w:w="1295" w:type="dxa"/>
+          </w:tcPr>
+          <w:p>
+            <w:pPr>
+              <w:pStyle w:val="Compact"/>
+              <w:jc w:val="left"/>
+            </w:pPr>
+            <w:r>
+              <w:t xml:space="preserve">FR-CAT-20</w:t>
+            </w:r>
+          </w:p>
+        </w:tc>
+        <w:tc>
+          <w:tcPr>
+            <w:tcW w:w="5120" w:type="dxa"/>
+          </w:tcPr>
+          <w:p>
+            <w:pPr>
+              <w:pStyle w:val="Compact"/>
+              <w:jc w:val="left"/>
+            </w:pPr>
+            <w:r>
+              <w:t xml:space="preserve">An eBay source shall sign in with the admin's keys, search each listed query, accept only new, fixed-price, UK-located GBP listings, and never treat a missing result as removal.</w:t>
+            </w:r>
+          </w:p>
+        </w:tc>
+        <w:tc>
+          <w:tcPr>
+            <w:tcW w:w="605" w:type="dxa"/>
+          </w:tcPr>
+          <w:p>
+            <w:pPr>
+              <w:pStyle w:val="Compact"/>
+              <w:jc w:val="left"/>
+            </w:pPr>
+            <w:r>
+              <w:t xml:space="preserve">M</w:t>
+            </w:r>
+          </w:p>
+        </w:tc>
+        <w:tc>
+          <w:tcPr>
+            <w:tcW w:w="2340" w:type="dxa"/>
+          </w:tcPr>
+          <w:p>
+            <w:pPr>
+              <w:pStyle w:val="Compact"/>
+              <w:jc w:val="left"/>
+            </w:pPr>
             <w:r>
               <w:rPr>
                 <w:rStyle w:val="VerbatimChar"/>
                 <w:sz w:val="16"/>
                 <w:szCs w:val="16"/>
               </w:rPr>
-              <w:t xml:space="preserve">robots.txt</w:t>
-            </w:r>
-            <w:r>
-              <w:t xml:space="preserve"> </w:t>
-            </w:r>
-            <w:r>
-              <w:t xml:space="preserve">and any</w:t>
+              <w:t xml:space="preserve">ebay.test.ts</w:t>
+            </w:r>
+          </w:p>
+        </w:tc>
+      </w:tr>
+      <w:tr>
+        <w:trPr>
+          <w:cantSplit/>
+        </w:trPr>
+        <w:tc>
+          <w:tcPr>
+            <w:tcW w:w="1295" w:type="dxa"/>
+          </w:tcPr>
+          <w:p>
+            <w:pPr>
+              <w:pStyle w:val="Compact"/>
+              <w:jc w:val="left"/>
+            </w:pPr>
+            <w:r>
+              <w:t xml:space="preserve">FR-CAT-21</w:t>
+            </w:r>
+          </w:p>
+        </w:tc>
+        <w:tc>
+          <w:tcPr>
+            <w:tcW w:w="5120" w:type="dxa"/>
+          </w:tcPr>
+          <w:p>
+            <w:pPr>
+              <w:pStyle w:val="Compact"/>
+              <w:jc w:val="left"/>
+            </w:pPr>
+            <w:r>
+              <w:t xml:space="preserve">A Diffbot source shall read each listed product page through Diffbot's Product API using the admin's token, check the shop's</w:t>
             </w:r>
             <w:r>
               <w:t xml:space="preserve"> </w:t>
@@ -12331,10 +13193,13 @@
                 <w:sz w:val="16"/>
                 <w:szCs w:val="16"/>
               </w:rPr>
-              <w:t xml:space="preserve">Crawl-delay</w:t>
-            </w:r>
-            <w:r>
-              <w:t xml:space="preserve">, with at least 2 seconds between requests to one shop.</w:t>
+              <w:t xml:space="preserve">robots.txt</w:t>
+            </w:r>
+            <w:r>
+              <w:t xml:space="preserve"> </w:t>
+            </w:r>
+            <w:r>
+              <w:t xml:space="preserve">first and send nothing for a disallowed page, accept only prices in GBP, stop on a bad token, exhausted credits or rate limit, and never treat the list as complete.</w:t>
             </w:r>
           </w:p>
         </w:tc>
@@ -12354,7 +13219,7 @@
         </w:tc>
         <w:tc>
           <w:tcPr>
-            <w:tcW w:w="2239" w:type="dxa"/>
+            <w:tcW w:w="2340" w:type="dxa"/>
           </w:tcPr>
           <w:p>
             <w:pPr>
@@ -12367,7 +13232,7 @@
                 <w:sz w:val="16"/>
                 <w:szCs w:val="16"/>
               </w:rPr>
-              <w:t xml:space="preserve">net.test.ts</w:t>
+              <w:t xml:space="preserve">diffbot.test.ts</w:t>
             </w:r>
           </w:p>
         </w:tc>
@@ -12386,123 +13251,49 @@
               <w:jc w:val="left"/>
             </w:pPr>
             <w:r>
-              <w:t xml:space="preserve">FR-CAT-31</w:t>
-            </w:r>
-          </w:p>
-        </w:tc>
-        <w:tc>
-          <w:tcPr>
-            <w:tcW w:w="5221" w:type="dxa"/>
-          </w:tcPr>
-          <w:p>
-            <w:pPr>
-              <w:pStyle w:val="Compact"/>
-              <w:jc w:val="left"/>
-            </w:pPr>
-            <w:r>
-              <w:t xml:space="preserve">The importer shall fetch only http/https on ports 80 and 443, never reach private or internal addresses (also checked at name resolution), follow at most three redirects (each re-validated), and enforce size and time limits.</w:t>
-            </w:r>
-          </w:p>
-        </w:tc>
-        <w:tc>
-          <w:tcPr>
-            <w:tcW w:w="605" w:type="dxa"/>
-          </w:tcPr>
-          <w:p>
-            <w:pPr>
-              <w:pStyle w:val="Compact"/>
-              <w:jc w:val="left"/>
-            </w:pPr>
-            <w:r>
-              <w:t xml:space="preserve">M</w:t>
-            </w:r>
-          </w:p>
-        </w:tc>
-        <w:tc>
-          <w:tcPr>
-            <w:tcW w:w="2239" w:type="dxa"/>
-          </w:tcPr>
-          <w:p>
-            <w:pPr>
-              <w:pStyle w:val="Compact"/>
-              <w:jc w:val="left"/>
-            </w:pPr>
+              <w:t xml:space="preserve">FR-CAT-30</w:t>
+            </w:r>
+          </w:p>
+        </w:tc>
+        <w:tc>
+          <w:tcPr>
+            <w:tcW w:w="5120" w:type="dxa"/>
+          </w:tcPr>
+          <w:p>
+            <w:pPr>
+              <w:pStyle w:val="Compact"/>
+              <w:jc w:val="left"/>
+            </w:pPr>
+            <w:r>
+              <w:t xml:space="preserve">The importer shall identify itself honestly (</w:t>
+            </w:r>
             <w:r>
               <w:rPr>
                 <w:rStyle w:val="VerbatimChar"/>
                 <w:sz w:val="16"/>
                 <w:szCs w:val="16"/>
               </w:rPr>
-              <w:t xml:space="preserve">net.test.ts</w:t>
-            </w:r>
-          </w:p>
-        </w:tc>
-      </w:tr>
-      <w:tr>
-        <w:trPr>
-          <w:cantSplit/>
-        </w:trPr>
-        <w:tc>
-          <w:tcPr>
-            <w:tcW w:w="1295" w:type="dxa"/>
-          </w:tcPr>
-          <w:p>
-            <w:pPr>
-              <w:pStyle w:val="Compact"/>
-              <w:jc w:val="left"/>
-            </w:pPr>
-            <w:r>
-              <w:t xml:space="preserve">FR-CAT-32</w:t>
-            </w:r>
-          </w:p>
-        </w:tc>
-        <w:tc>
-          <w:tcPr>
-            <w:tcW w:w="5221" w:type="dxa"/>
-          </w:tcPr>
-          <w:p>
-            <w:pPr>
-              <w:pStyle w:val="Compact"/>
-              <w:jc w:val="left"/>
-            </w:pPr>
-            <w:r>
-              <w:t xml:space="preserve">When a shop answers 401, 403, 429 or 451, or shows a verification page, the importer shall stop, pause that source for 24 hours and tell staff.</w:t>
-            </w:r>
-          </w:p>
-        </w:tc>
-        <w:tc>
-          <w:tcPr>
-            <w:tcW w:w="605" w:type="dxa"/>
-          </w:tcPr>
-          <w:p>
-            <w:pPr>
-              <w:pStyle w:val="Compact"/>
-              <w:jc w:val="left"/>
-            </w:pPr>
-            <w:r>
-              <w:t xml:space="preserve">M</w:t>
-            </w:r>
-          </w:p>
-        </w:tc>
-        <w:tc>
-          <w:tcPr>
-            <w:tcW w:w="2239" w:type="dxa"/>
-          </w:tcPr>
-          <w:p>
-            <w:pPr>
-              <w:pStyle w:val="Compact"/>
-              <w:jc w:val="left"/>
-            </w:pPr>
+              <w:t xml:space="preserve">ShopCatalogBot</w:t>
+            </w:r>
+            <w:r>
+              <w:t xml:space="preserve">, with this site's address in its user agent) and obey</w:t>
+            </w:r>
+            <w:r>
+              <w:t xml:space="preserve"> </w:t>
+            </w:r>
             <w:r>
               <w:rPr>
                 <w:rStyle w:val="VerbatimChar"/>
                 <w:sz w:val="16"/>
                 <w:szCs w:val="16"/>
               </w:rPr>
-              <w:t xml:space="preserve">net.test.ts</w:t>
-            </w:r>
-            <w:r>
-              <w:t xml:space="preserve">;</w:t>
+              <w:t xml:space="preserve">robots.txt</w:t>
+            </w:r>
+            <w:r>
+              <w:t xml:space="preserve"> </w:t>
+            </w:r>
+            <w:r>
+              <w:t xml:space="preserve">and any</w:t>
             </w:r>
             <w:r>
               <w:t xml:space="preserve"> </w:t>
@@ -12513,40 +13304,10 @@
                 <w:sz w:val="16"/>
                 <w:szCs w:val="16"/>
               </w:rPr>
-              <w:t xml:space="preserve">run.test.ts</w:t>
-            </w:r>
-          </w:p>
-        </w:tc>
-      </w:tr>
-      <w:tr>
-        <w:trPr>
-          <w:cantSplit/>
-        </w:trPr>
-        <w:tc>
-          <w:tcPr>
-            <w:tcW w:w="1295" w:type="dxa"/>
-          </w:tcPr>
-          <w:p>
-            <w:pPr>
-              <w:pStyle w:val="Compact"/>
-              <w:jc w:val="left"/>
-            </w:pPr>
-            <w:r>
-              <w:t xml:space="preserve">FR-CAT-33</w:t>
-            </w:r>
-          </w:p>
-        </w:tc>
-        <w:tc>
-          <w:tcPr>
-            <w:tcW w:w="5221" w:type="dxa"/>
-          </w:tcPr>
-          <w:p>
-            <w:pPr>
-              <w:pStyle w:val="Compact"/>
-              <w:jc w:val="left"/>
-            </w:pPr>
-            <w:r>
-              <w:t xml:space="preserve">The importer shall never evade a block: no changed identity, rotating addresses, or CAPTCHA solving.</w:t>
+              <w:t xml:space="preserve">Crawl-delay</w:t>
+            </w:r>
+            <w:r>
+              <w:t xml:space="preserve">, with at least 2 seconds between requests to one shop.</w:t>
             </w:r>
           </w:p>
         </w:tc>
@@ -12566,19 +13327,13 @@
         </w:tc>
         <w:tc>
           <w:tcPr>
-            <w:tcW w:w="2239" w:type="dxa"/>
-          </w:tcPr>
-          <w:p>
-            <w:pPr>
-              <w:pStyle w:val="Compact"/>
-              <w:jc w:val="left"/>
-            </w:pPr>
-            <w:r>
-              <w:t xml:space="preserve">Inspection;</w:t>
-            </w:r>
-            <w:r>
-              <w:t xml:space="preserve"> </w:t>
-            </w:r>
+            <w:tcW w:w="2340" w:type="dxa"/>
+          </w:tcPr>
+          <w:p>
+            <w:pPr>
+              <w:pStyle w:val="Compact"/>
+              <w:jc w:val="left"/>
+            </w:pPr>
             <w:r>
               <w:rPr>
                 <w:rStyle w:val="VerbatimChar"/>
@@ -12604,13 +13359,231 @@
               <w:jc w:val="left"/>
             </w:pPr>
             <w:r>
+              <w:t xml:space="preserve">FR-CAT-31</w:t>
+            </w:r>
+          </w:p>
+        </w:tc>
+        <w:tc>
+          <w:tcPr>
+            <w:tcW w:w="5120" w:type="dxa"/>
+          </w:tcPr>
+          <w:p>
+            <w:pPr>
+              <w:pStyle w:val="Compact"/>
+              <w:jc w:val="left"/>
+            </w:pPr>
+            <w:r>
+              <w:t xml:space="preserve">The importer shall fetch only http/https on ports 80 and 443, never reach private or internal addresses (also checked at name resolution), follow at most three redirects (each re-validated), and enforce size and time limits.</w:t>
+            </w:r>
+          </w:p>
+        </w:tc>
+        <w:tc>
+          <w:tcPr>
+            <w:tcW w:w="605" w:type="dxa"/>
+          </w:tcPr>
+          <w:p>
+            <w:pPr>
+              <w:pStyle w:val="Compact"/>
+              <w:jc w:val="left"/>
+            </w:pPr>
+            <w:r>
+              <w:t xml:space="preserve">M</w:t>
+            </w:r>
+          </w:p>
+        </w:tc>
+        <w:tc>
+          <w:tcPr>
+            <w:tcW w:w="2340" w:type="dxa"/>
+          </w:tcPr>
+          <w:p>
+            <w:pPr>
+              <w:pStyle w:val="Compact"/>
+              <w:jc w:val="left"/>
+            </w:pPr>
+            <w:r>
+              <w:rPr>
+                <w:rStyle w:val="VerbatimChar"/>
+                <w:sz w:val="16"/>
+                <w:szCs w:val="16"/>
+              </w:rPr>
+              <w:t xml:space="preserve">net.test.ts</w:t>
+            </w:r>
+          </w:p>
+        </w:tc>
+      </w:tr>
+      <w:tr>
+        <w:trPr>
+          <w:cantSplit/>
+        </w:trPr>
+        <w:tc>
+          <w:tcPr>
+            <w:tcW w:w="1295" w:type="dxa"/>
+          </w:tcPr>
+          <w:p>
+            <w:pPr>
+              <w:pStyle w:val="Compact"/>
+              <w:jc w:val="left"/>
+            </w:pPr>
+            <w:r>
+              <w:t xml:space="preserve">FR-CAT-32</w:t>
+            </w:r>
+          </w:p>
+        </w:tc>
+        <w:tc>
+          <w:tcPr>
+            <w:tcW w:w="5120" w:type="dxa"/>
+          </w:tcPr>
+          <w:p>
+            <w:pPr>
+              <w:pStyle w:val="Compact"/>
+              <w:jc w:val="left"/>
+            </w:pPr>
+            <w:r>
+              <w:t xml:space="preserve">When a shop answers 401, 403, 429 or 451, or shows a verification page, the importer shall stop, pause that source for 24 hours and tell staff.</w:t>
+            </w:r>
+          </w:p>
+        </w:tc>
+        <w:tc>
+          <w:tcPr>
+            <w:tcW w:w="605" w:type="dxa"/>
+          </w:tcPr>
+          <w:p>
+            <w:pPr>
+              <w:pStyle w:val="Compact"/>
+              <w:jc w:val="left"/>
+            </w:pPr>
+            <w:r>
+              <w:t xml:space="preserve">M</w:t>
+            </w:r>
+          </w:p>
+        </w:tc>
+        <w:tc>
+          <w:tcPr>
+            <w:tcW w:w="2340" w:type="dxa"/>
+          </w:tcPr>
+          <w:p>
+            <w:pPr>
+              <w:pStyle w:val="Compact"/>
+              <w:jc w:val="left"/>
+            </w:pPr>
+            <w:r>
+              <w:rPr>
+                <w:rStyle w:val="VerbatimChar"/>
+                <w:sz w:val="16"/>
+                <w:szCs w:val="16"/>
+              </w:rPr>
+              <w:t xml:space="preserve">net.test.ts</w:t>
+            </w:r>
+            <w:r>
+              <w:t xml:space="preserve">;</w:t>
+            </w:r>
+            <w:r>
+              <w:t xml:space="preserve"> </w:t>
+            </w:r>
+            <w:r>
+              <w:rPr>
+                <w:rStyle w:val="VerbatimChar"/>
+                <w:sz w:val="16"/>
+                <w:szCs w:val="16"/>
+              </w:rPr>
+              <w:t xml:space="preserve">run.test.ts</w:t>
+            </w:r>
+          </w:p>
+        </w:tc>
+      </w:tr>
+      <w:tr>
+        <w:trPr>
+          <w:cantSplit/>
+        </w:trPr>
+        <w:tc>
+          <w:tcPr>
+            <w:tcW w:w="1295" w:type="dxa"/>
+          </w:tcPr>
+          <w:p>
+            <w:pPr>
+              <w:pStyle w:val="Compact"/>
+              <w:jc w:val="left"/>
+            </w:pPr>
+            <w:r>
+              <w:t xml:space="preserve">FR-CAT-33</w:t>
+            </w:r>
+          </w:p>
+        </w:tc>
+        <w:tc>
+          <w:tcPr>
+            <w:tcW w:w="5120" w:type="dxa"/>
+          </w:tcPr>
+          <w:p>
+            <w:pPr>
+              <w:pStyle w:val="Compact"/>
+              <w:jc w:val="left"/>
+            </w:pPr>
+            <w:r>
+              <w:t xml:space="preserve">The importer shall never evade a block: no changed identity, rotating addresses, or CAPTCHA solving.</w:t>
+            </w:r>
+          </w:p>
+        </w:tc>
+        <w:tc>
+          <w:tcPr>
+            <w:tcW w:w="605" w:type="dxa"/>
+          </w:tcPr>
+          <w:p>
+            <w:pPr>
+              <w:pStyle w:val="Compact"/>
+              <w:jc w:val="left"/>
+            </w:pPr>
+            <w:r>
+              <w:t xml:space="preserve">M</w:t>
+            </w:r>
+          </w:p>
+        </w:tc>
+        <w:tc>
+          <w:tcPr>
+            <w:tcW w:w="2340" w:type="dxa"/>
+          </w:tcPr>
+          <w:p>
+            <w:pPr>
+              <w:pStyle w:val="Compact"/>
+              <w:jc w:val="left"/>
+            </w:pPr>
+            <w:r>
+              <w:t xml:space="preserve">Inspection;</w:t>
+            </w:r>
+            <w:r>
+              <w:t xml:space="preserve"> </w:t>
+            </w:r>
+            <w:r>
+              <w:rPr>
+                <w:rStyle w:val="VerbatimChar"/>
+                <w:sz w:val="16"/>
+                <w:szCs w:val="16"/>
+              </w:rPr>
+              <w:t xml:space="preserve">net.test.ts</w:t>
+            </w:r>
+          </w:p>
+        </w:tc>
+      </w:tr>
+      <w:tr>
+        <w:trPr>
+          <w:cantSplit/>
+        </w:trPr>
+        <w:tc>
+          <w:tcPr>
+            <w:tcW w:w="1295" w:type="dxa"/>
+          </w:tcPr>
+          <w:p>
+            <w:pPr>
+              <w:pStyle w:val="Compact"/>
+              <w:jc w:val="left"/>
+            </w:pPr>
+            <w:r>
               <w:t xml:space="preserve">FR-CAT-34</w:t>
             </w:r>
           </w:p>
         </w:tc>
         <w:tc>
           <w:tcPr>
-            <w:tcW w:w="5221" w:type="dxa"/>
+            <w:tcW w:w="5120" w:type="dxa"/>
           </w:tcPr>
           <w:p>
             <w:pPr>
@@ -12638,7 +13611,7 @@
         </w:tc>
         <w:tc>
           <w:tcPr>
-            <w:tcW w:w="2239" w:type="dxa"/>
+            <w:tcW w:w="2340" w:type="dxa"/>
           </w:tcPr>
           <w:p>
             <w:pPr>
@@ -14501,9 +15474,9 @@
       </w:tblPr>
       <w:tblGrid>
         <w:gridCol w:w="1295"/>
-        <w:gridCol w:w="5092"/>
+        <w:gridCol w:w="4942"/>
         <w:gridCol w:w="605"/>
-        <w:gridCol w:w="2368"/>
+        <w:gridCol w:w="2518"/>
       </w:tblGrid>
       <w:tr>
         <w:trPr>
@@ -14528,7 +15501,7 @@
         </w:tc>
         <w:tc>
           <w:tcPr>
-            <w:tcW w:w="5092" w:type="dxa"/>
+            <w:tcW w:w="4942" w:type="dxa"/>
           </w:tcPr>
           <w:p>
             <w:pPr>
@@ -14556,7 +15529,7 @@
         </w:tc>
         <w:tc>
           <w:tcPr>
-            <w:tcW w:w="2368" w:type="dxa"/>
+            <w:tcW w:w="2518" w:type="dxa"/>
           </w:tcPr>
           <w:p>
             <w:pPr>
@@ -14589,7 +15562,7 @@
         </w:tc>
         <w:tc>
           <w:tcPr>
-            <w:tcW w:w="5092" w:type="dxa"/>
+            <w:tcW w:w="4942" w:type="dxa"/>
           </w:tcPr>
           <w:p>
             <w:pPr>
@@ -14642,7 +15615,7 @@
         </w:tc>
         <w:tc>
           <w:tcPr>
-            <w:tcW w:w="2368" w:type="dxa"/>
+            <w:tcW w:w="2518" w:type="dxa"/>
           </w:tcPr>
           <w:p>
             <w:pPr>
@@ -14675,7 +15648,7 @@
         </w:tc>
         <w:tc>
           <w:tcPr>
-            <w:tcW w:w="5092" w:type="dxa"/>
+            <w:tcW w:w="4942" w:type="dxa"/>
           </w:tcPr>
           <w:p>
             <w:pPr>
@@ -14742,7 +15715,7 @@
         </w:tc>
         <w:tc>
           <w:tcPr>
-            <w:tcW w:w="2368" w:type="dxa"/>
+            <w:tcW w:w="2518" w:type="dxa"/>
           </w:tcPr>
           <w:p>
             <w:pPr>
@@ -14775,7 +15748,7 @@
         </w:tc>
         <w:tc>
           <w:tcPr>
-            <w:tcW w:w="5092" w:type="dxa"/>
+            <w:tcW w:w="4942" w:type="dxa"/>
           </w:tcPr>
           <w:p>
             <w:pPr>
@@ -14803,7 +15776,7 @@
         </w:tc>
         <w:tc>
           <w:tcPr>
-            <w:tcW w:w="2368" w:type="dxa"/>
+            <w:tcW w:w="2518" w:type="dxa"/>
           </w:tcPr>
           <w:p>
             <w:pPr>
@@ -14869,7 +15842,7 @@
         </w:tc>
         <w:tc>
           <w:tcPr>
-            <w:tcW w:w="5092" w:type="dxa"/>
+            <w:tcW w:w="4942" w:type="dxa"/>
           </w:tcPr>
           <w:p>
             <w:pPr>
@@ -14897,7 +15870,7 @@
         </w:tc>
         <w:tc>
           <w:tcPr>
-            <w:tcW w:w="2368" w:type="dxa"/>
+            <w:tcW w:w="2518" w:type="dxa"/>
           </w:tcPr>
           <w:p>
             <w:pPr>
@@ -14935,7 +15908,7 @@
         </w:tc>
         <w:tc>
           <w:tcPr>
-            <w:tcW w:w="5092" w:type="dxa"/>
+            <w:tcW w:w="4942" w:type="dxa"/>
           </w:tcPr>
           <w:p>
             <w:pPr>
@@ -14980,7 +15953,7 @@
         </w:tc>
         <w:tc>
           <w:tcPr>
-            <w:tcW w:w="2368" w:type="dxa"/>
+            <w:tcW w:w="2518" w:type="dxa"/>
           </w:tcPr>
           <w:p>
             <w:pPr>
@@ -15013,7 +15986,7 @@
         </w:tc>
         <w:tc>
           <w:tcPr>
-            <w:tcW w:w="5092" w:type="dxa"/>
+            <w:tcW w:w="4942" w:type="dxa"/>
           </w:tcPr>
           <w:p>
             <w:pPr>
@@ -15041,7 +16014,7 @@
         </w:tc>
         <w:tc>
           <w:tcPr>
-            <w:tcW w:w="2368" w:type="dxa"/>
+            <w:tcW w:w="2518" w:type="dxa"/>
           </w:tcPr>
           <w:p>
             <w:pPr>
@@ -15085,7 +16058,7 @@
         </w:tc>
         <w:tc>
           <w:tcPr>
-            <w:tcW w:w="5092" w:type="dxa"/>
+            <w:tcW w:w="4942" w:type="dxa"/>
           </w:tcPr>
           <w:p>
             <w:pPr>
@@ -15113,7 +16086,7 @@
         </w:tc>
         <w:tc>
           <w:tcPr>
-            <w:tcW w:w="2368" w:type="dxa"/>
+            <w:tcW w:w="2518" w:type="dxa"/>
           </w:tcPr>
           <w:p>
             <w:pPr>
@@ -15154,7 +16127,7 @@
         </w:tc>
         <w:tc>
           <w:tcPr>
-            <w:tcW w:w="5092" w:type="dxa"/>
+            <w:tcW w:w="4942" w:type="dxa"/>
           </w:tcPr>
           <w:p>
             <w:pPr>
@@ -15193,15 +16166,15 @@
         </w:tc>
         <w:tc>
           <w:tcPr>
-            <w:tcW w:w="2368" w:type="dxa"/>
-          </w:tcPr>
-          <w:p>
-            <w:pPr>
-              <w:pStyle w:val="Compact"/>
-              <w:jc w:val="left"/>
-            </w:pPr>
-            <w:r>
-              <w:t xml:space="preserve">E2E</w:t>
+            <w:tcW w:w="2518" w:type="dxa"/>
+          </w:tcPr>
+          <w:p>
+            <w:pPr>
+              <w:pStyle w:val="Compact"/>
+              <w:jc w:val="left"/>
+            </w:pPr>
+            <w:r>
+              <w:t xml:space="preserve">E2E checks the page is gone</w:t>
             </w:r>
           </w:p>
         </w:tc>
@@ -16315,7 +17288,35 @@
                 <w:sz w:val="16"/>
                 <w:szCs w:val="16"/>
               </w:rPr>
+              <w:t xml:space="preserve">diffbot.test.ts</w:t>
+            </w:r>
+            <w:r>
+              <w:t xml:space="preserve">,</w:t>
+            </w:r>
+            <w:r>
+              <w:t xml:space="preserve"> </w:t>
+            </w:r>
+            <w:r>
+              <w:rPr>
+                <w:rStyle w:val="VerbatimChar"/>
+                <w:sz w:val="16"/>
+                <w:szCs w:val="16"/>
+              </w:rPr>
               <w:t xml:space="preserve">shopify.test.ts</w:t>
+            </w:r>
+            <w:r>
+              <w:t xml:space="preserve">,</w:t>
+            </w:r>
+            <w:r>
+              <w:t xml:space="preserve"> </w:t>
+            </w:r>
+            <w:r>
+              <w:rPr>
+                <w:rStyle w:val="VerbatimChar"/>
+                <w:sz w:val="16"/>
+                <w:szCs w:val="16"/>
+              </w:rPr>
+              <w:t xml:space="preserve">woocommerce.test.ts</w:t>
             </w:r>
             <w:r>
               <w:t xml:space="preserve">,</w:t>
@@ -16872,7 +17873,7 @@
         <w:pStyle w:val="Compact"/>
       </w:pPr>
       <w:r>
-        <w:t xml:space="preserve">Catalogue sources need permission and refuse internal addresses; a source can be created and removed; the eBay, Shopify and file-import forms work.</w:t>
+        <w:t xml:space="preserve">Catalogue sources need permission and refuse internal addresses; a source can be created and removed; the eBay, Diffbot, Shopify and file-import forms work.</w:t>
       </w:r>
     </w:p>
     <w:p>
@@ -25083,8 +26084,8 @@
       </w:tblPr>
       <w:tblGrid>
         <w:gridCol w:w="1065"/>
-        <w:gridCol w:w="1097"/>
-        <w:gridCol w:w="7198"/>
+        <w:gridCol w:w="1252"/>
+        <w:gridCol w:w="7043"/>
       </w:tblGrid>
       <w:tr>
         <w:trPr>
@@ -25109,7 +26110,7 @@
         </w:tc>
         <w:tc>
           <w:tcPr>
-            <w:tcW w:w="1097" w:type="dxa"/>
+            <w:tcW w:w="1252" w:type="dxa"/>
           </w:tcPr>
           <w:p>
             <w:pPr>
@@ -25123,7 +26124,7 @@
         </w:tc>
         <w:tc>
           <w:tcPr>
-            <w:tcW w:w="7198" w:type="dxa"/>
+            <w:tcW w:w="7043" w:type="dxa"/>
           </w:tcPr>
           <w:p>
             <w:pPr>
@@ -25156,7 +26157,7 @@
         </w:tc>
         <w:tc>
           <w:tcPr>
-            <w:tcW w:w="1097" w:type="dxa"/>
+            <w:tcW w:w="1252" w:type="dxa"/>
           </w:tcPr>
           <w:p>
             <w:pPr>
@@ -25170,7 +26171,7 @@
         </w:tc>
         <w:tc>
           <w:tcPr>
-            <w:tcW w:w="7198" w:type="dxa"/>
+            <w:tcW w:w="7043" w:type="dxa"/>
           </w:tcPr>
           <w:p>
             <w:pPr>
@@ -25179,6 +26180,53 @@
             </w:pPr>
             <w:r>
               <w:t xml:space="preserve">First complete issue of the SRS, with every requirement numbered, prioritised and given a means of verification.</w:t>
+            </w:r>
+          </w:p>
+        </w:tc>
+      </w:tr>
+      <w:tr>
+        <w:trPr>
+          <w:cantSplit/>
+        </w:trPr>
+        <w:tc>
+          <w:tcPr>
+            <w:tcW w:w="1065" w:type="dxa"/>
+          </w:tcPr>
+          <w:p>
+            <w:pPr>
+              <w:pStyle w:val="Compact"/>
+              <w:jc w:val="left"/>
+            </w:pPr>
+            <w:r>
+              <w:t xml:space="preserve">1.1</w:t>
+            </w:r>
+          </w:p>
+        </w:tc>
+        <w:tc>
+          <w:tcPr>
+            <w:tcW w:w="1252" w:type="dxa"/>
+          </w:tcPr>
+          <w:p>
+            <w:pPr>
+              <w:pStyle w:val="Compact"/>
+              <w:jc w:val="left"/>
+            </w:pPr>
+            <w:r>
+              <w:t xml:space="preserve">9 October 2026</w:t>
+            </w:r>
+          </w:p>
+        </w:tc>
+        <w:tc>
+          <w:tcPr>
+            <w:tcW w:w="7043" w:type="dxa"/>
+          </w:tcPr>
+          <w:p>
+            <w:pPr>
+              <w:pStyle w:val="Compact"/>
+              <w:jc w:val="left"/>
+            </w:pPr>
+            <w:r>
+              <w:t xml:space="preserve">Added FR-LNK-12 to -15 (ordering from Amazon UK by link, hand-off search, bookmarklet, phone Share menu, requests described in words).</w:t>
             </w:r>
           </w:p>
         </w:tc>

</xml_diff>

<commit_message>
Remove all discount claims from the shop
No percentage-off tags, was prices, 'You save' amounts, deal labels or countdowns
anywhere; the Today's deals shelf, nav links, deals filter and biggest-discount
sort are gone. Feeds' was-prices are no longer stored on items (earlier ones are
cleared at start-up) and the admin no longer has Was price / Deal ends fields.
SRS, docs and tests updated to match.

Co-Authored-By: Claude Sonnet 5.5 <noreply@anthropic.com>
Claude-Session: https://claude.ai/code/session_019DA74PgeWyV7f6WtdreRuq
</commit_message>
<xml_diff>
--- a/docs/pdf/SRS-Anknovate.docx
+++ b/docs/pdf/SRS-Anknovate.docx
@@ -4443,9 +4443,9 @@
       </w:tblPr>
       <w:tblGrid>
         <w:gridCol w:w="1295"/>
-        <w:gridCol w:w="5117"/>
+        <w:gridCol w:w="4994"/>
         <w:gridCol w:w="605"/>
-        <w:gridCol w:w="2343"/>
+        <w:gridCol w:w="2466"/>
       </w:tblGrid>
       <w:tr>
         <w:trPr>
@@ -4470,7 +4470,7 @@
         </w:tc>
         <w:tc>
           <w:tcPr>
-            <w:tcW w:w="5117" w:type="dxa"/>
+            <w:tcW w:w="4994" w:type="dxa"/>
           </w:tcPr>
           <w:p>
             <w:pPr>
@@ -4498,7 +4498,7 @@
         </w:tc>
         <w:tc>
           <w:tcPr>
-            <w:tcW w:w="2343" w:type="dxa"/>
+            <w:tcW w:w="2466" w:type="dxa"/>
           </w:tcPr>
           <w:p>
             <w:pPr>
@@ -4531,15 +4531,15 @@
         </w:tc>
         <w:tc>
           <w:tcPr>
-            <w:tcW w:w="5117" w:type="dxa"/>
-          </w:tcPr>
-          <w:p>
-            <w:pPr>
-              <w:pStyle w:val="Compact"/>
-              <w:jc w:val="left"/>
-            </w:pPr>
-            <w:r>
-              <w:t xml:space="preserve">The system shall show a home page with featured offers, a paste-a-link entry, departments, today's deals, new arrivals, best sellers, and recently viewed items.</w:t>
+            <w:tcW w:w="4994" w:type="dxa"/>
+          </w:tcPr>
+          <w:p>
+            <w:pPr>
+              <w:pStyle w:val="Compact"/>
+              <w:jc w:val="left"/>
+            </w:pPr>
+            <w:r>
+              <w:t xml:space="preserve">The system shall show a home page with featured banners, a paste-a-link entry, departments, new arrivals, best sellers, and recently viewed items.</w:t>
             </w:r>
           </w:p>
         </w:tc>
@@ -4559,7 +4559,7 @@
         </w:tc>
         <w:tc>
           <w:tcPr>
-            <w:tcW w:w="2343" w:type="dxa"/>
+            <w:tcW w:w="2466" w:type="dxa"/>
           </w:tcPr>
           <w:p>
             <w:pPr>
@@ -4592,7 +4592,7 @@
         </w:tc>
         <w:tc>
           <w:tcPr>
-            <w:tcW w:w="5117" w:type="dxa"/>
+            <w:tcW w:w="4994" w:type="dxa"/>
           </w:tcPr>
           <w:p>
             <w:pPr>
@@ -4620,7 +4620,7 @@
         </w:tc>
         <w:tc>
           <w:tcPr>
-            <w:tcW w:w="2343" w:type="dxa"/>
+            <w:tcW w:w="2466" w:type="dxa"/>
           </w:tcPr>
           <w:p>
             <w:pPr>
@@ -4664,7 +4664,7 @@
         </w:tc>
         <w:tc>
           <w:tcPr>
-            <w:tcW w:w="5117" w:type="dxa"/>
+            <w:tcW w:w="4994" w:type="dxa"/>
           </w:tcPr>
           <w:p>
             <w:pPr>
@@ -4692,7 +4692,7 @@
         </w:tc>
         <w:tc>
           <w:tcPr>
-            <w:tcW w:w="2343" w:type="dxa"/>
+            <w:tcW w:w="2466" w:type="dxa"/>
           </w:tcPr>
           <w:p>
             <w:pPr>
@@ -4730,7 +4730,7 @@
         </w:tc>
         <w:tc>
           <w:tcPr>
-            <w:tcW w:w="5117" w:type="dxa"/>
+            <w:tcW w:w="4994" w:type="dxa"/>
           </w:tcPr>
           <w:p>
             <w:pPr>
@@ -4758,7 +4758,7 @@
         </w:tc>
         <w:tc>
           <w:tcPr>
-            <w:tcW w:w="2343" w:type="dxa"/>
+            <w:tcW w:w="2466" w:type="dxa"/>
           </w:tcPr>
           <w:p>
             <w:pPr>
@@ -4802,7 +4802,7 @@
         </w:tc>
         <w:tc>
           <w:tcPr>
-            <w:tcW w:w="5117" w:type="dxa"/>
+            <w:tcW w:w="4994" w:type="dxa"/>
           </w:tcPr>
           <w:p>
             <w:pPr>
@@ -4830,7 +4830,7 @@
         </w:tc>
         <w:tc>
           <w:tcPr>
-            <w:tcW w:w="2343" w:type="dxa"/>
+            <w:tcW w:w="2466" w:type="dxa"/>
           </w:tcPr>
           <w:p>
             <w:pPr>
@@ -4863,15 +4863,15 @@
         </w:tc>
         <w:tc>
           <w:tcPr>
-            <w:tcW w:w="5117" w:type="dxa"/>
-          </w:tcPr>
-          <w:p>
-            <w:pPr>
-              <w:pStyle w:val="Compact"/>
-              <w:jc w:val="left"/>
-            </w:pPr>
-            <w:r>
-              <w:t xml:space="preserve">Results shall be filterable by department, shop, item category, price range (typed in cedis), and deals only, and sortable by featured, price low-to-high, price high-to-low, best rated, newest and biggest discount, 24 per page.</w:t>
+            <w:tcW w:w="4994" w:type="dxa"/>
+          </w:tcPr>
+          <w:p>
+            <w:pPr>
+              <w:pStyle w:val="Compact"/>
+              <w:jc w:val="left"/>
+            </w:pPr>
+            <w:r>
+              <w:t xml:space="preserve">Results shall be filterable by department, shop, item category, price range (typed in cedis), and sortable by featured, price low-to-high, price high-to-low, best rated and newest, 24 per page.</w:t>
             </w:r>
           </w:p>
         </w:tc>
@@ -4891,7 +4891,7 @@
         </w:tc>
         <w:tc>
           <w:tcPr>
-            <w:tcW w:w="2343" w:type="dxa"/>
+            <w:tcW w:w="2466" w:type="dxa"/>
           </w:tcPr>
           <w:p>
             <w:pPr>
@@ -4929,7 +4929,7 @@
         </w:tc>
         <w:tc>
           <w:tcPr>
-            <w:tcW w:w="5117" w:type="dxa"/>
+            <w:tcW w:w="4994" w:type="dxa"/>
           </w:tcPr>
           <w:p>
             <w:pPr>
@@ -4957,7 +4957,7 @@
         </w:tc>
         <w:tc>
           <w:tcPr>
-            <w:tcW w:w="2343" w:type="dxa"/>
+            <w:tcW w:w="2466" w:type="dxa"/>
           </w:tcPr>
           <w:p>
             <w:pPr>
@@ -4995,15 +4995,15 @@
         </w:tc>
         <w:tc>
           <w:tcPr>
-            <w:tcW w:w="5117" w:type="dxa"/>
-          </w:tcPr>
-          <w:p>
-            <w:pPr>
-              <w:pStyle w:val="Compact"/>
-              <w:jc w:val="left"/>
-            </w:pPr>
-            <w:r>
-              <w:t xml:space="preserve">The product page shall show photos (or a fallback), price in pounds and cedis, was-price and deal percentage, size/colour options, quantity, the shop, a link to the item on the shop's own website, reviews and rating, related items from the same shop, a wishlist button and a share-on-WhatsApp link.</w:t>
+            <w:tcW w:w="4994" w:type="dxa"/>
+          </w:tcPr>
+          <w:p>
+            <w:pPr>
+              <w:pStyle w:val="Compact"/>
+              <w:jc w:val="left"/>
+            </w:pPr>
+            <w:r>
+              <w:t xml:space="preserve">The product page shall show photos (or a fallback), price in pounds and cedis, size/colour options, quantity, the shop, a link to the item on the shop's own website, reviews and rating, related items from the same shop, a wishlist button and a share-on-WhatsApp link.</w:t>
             </w:r>
           </w:p>
         </w:tc>
@@ -5023,7 +5023,7 @@
         </w:tc>
         <w:tc>
           <w:tcPr>
-            <w:tcW w:w="2343" w:type="dxa"/>
+            <w:tcW w:w="2466" w:type="dxa"/>
           </w:tcPr>
           <w:p>
             <w:pPr>
@@ -5056,7 +5056,7 @@
         </w:tc>
         <w:tc>
           <w:tcPr>
-            <w:tcW w:w="5117" w:type="dxa"/>
+            <w:tcW w:w="4994" w:type="dxa"/>
           </w:tcPr>
           <w:p>
             <w:pPr>
@@ -5084,7 +5084,7 @@
         </w:tc>
         <w:tc>
           <w:tcPr>
-            <w:tcW w:w="2343" w:type="dxa"/>
+            <w:tcW w:w="2466" w:type="dxa"/>
           </w:tcPr>
           <w:p>
             <w:pPr>
@@ -5125,7 +5125,7 @@
         </w:tc>
         <w:tc>
           <w:tcPr>
-            <w:tcW w:w="5117" w:type="dxa"/>
+            <w:tcW w:w="4994" w:type="dxa"/>
           </w:tcPr>
           <w:p>
             <w:pPr>
@@ -5153,7 +5153,7 @@
         </w:tc>
         <w:tc>
           <w:tcPr>
-            <w:tcW w:w="2343" w:type="dxa"/>
+            <w:tcW w:w="2466" w:type="dxa"/>
           </w:tcPr>
           <w:p>
             <w:pPr>
@@ -5186,7 +5186,7 @@
         </w:tc>
         <w:tc>
           <w:tcPr>
-            <w:tcW w:w="5117" w:type="dxa"/>
+            <w:tcW w:w="4994" w:type="dxa"/>
           </w:tcPr>
           <w:p>
             <w:pPr>
@@ -5214,7 +5214,7 @@
         </w:tc>
         <w:tc>
           <w:tcPr>
-            <w:tcW w:w="2343" w:type="dxa"/>
+            <w:tcW w:w="2466" w:type="dxa"/>
           </w:tcPr>
           <w:p>
             <w:pPr>
@@ -5258,15 +5258,15 @@
         </w:tc>
         <w:tc>
           <w:tcPr>
-            <w:tcW w:w="5117" w:type="dxa"/>
-          </w:tcPr>
-          <w:p>
-            <w:pPr>
-              <w:pStyle w:val="Compact"/>
-              <w:jc w:val="left"/>
-            </w:pPr>
-            <w:r>
-              <w:t xml:space="preserve">Deals shall be shown only while the was-price is higher than the price and the deal end time, if set, has not passed; a live countdown shall be shown.</w:t>
+            <w:tcW w:w="4994" w:type="dxa"/>
+          </w:tcPr>
+          <w:p>
+            <w:pPr>
+              <w:pStyle w:val="Compact"/>
+              <w:jc w:val="left"/>
+            </w:pPr>
+            <w:r>
+              <w:t xml:space="preserve">The system shall make no discount claims: no percentage-off tags, "was" prices, savings amounts, "deal" labels or countdowns. Prices a source reports as a "was" or list price shall not be stored on items or shown.</w:t>
             </w:r>
           </w:p>
         </w:tc>
@@ -5280,13 +5280,13 @@
               <w:jc w:val="left"/>
             </w:pPr>
             <w:r>
-              <w:t xml:space="preserve">S</w:t>
-            </w:r>
-          </w:p>
-        </w:tc>
-        <w:tc>
-          <w:tcPr>
-            <w:tcW w:w="2343" w:type="dxa"/>
+              <w:t xml:space="preserve">M</w:t>
+            </w:r>
+          </w:p>
+        </w:tc>
+        <w:tc>
+          <w:tcPr>
+            <w:tcW w:w="2466" w:type="dxa"/>
           </w:tcPr>
           <w:p>
             <w:pPr>
@@ -5305,7 +5305,18 @@
               <w:t xml:space="preserve"> </w:t>
             </w:r>
             <w:r>
-              <w:t xml:space="preserve">("deals")</w:t>
+              <w:t xml:space="preserve">("no discount claims");</w:t>
+            </w:r>
+            <w:r>
+              <w:t xml:space="preserve"> </w:t>
+            </w:r>
+            <w:r>
+              <w:rPr>
+                <w:rStyle w:val="VerbatimChar"/>
+                <w:sz w:val="16"/>
+                <w:szCs w:val="16"/>
+              </w:rPr>
+              <w:t xml:space="preserve">run.test.ts</w:t>
             </w:r>
           </w:p>
         </w:tc>
@@ -12092,7 +12103,7 @@
               <w:jc w:val="left"/>
             </w:pPr>
             <w:r>
-              <w:t xml:space="preserve">Staff shall be able to create and edit items (name, brand, category, description, UK price, was-price and deal end, weight, size/colour options, source link, photo upload or link, shown/hidden).</w:t>
+              <w:t xml:space="preserve">Staff shall be able to create and edit items (name, brand, category, description, UK price, weight, size/colour options, source link, photo upload or link, shown/hidden).</w:t>
             </w:r>
           </w:p>
         </w:tc>
@@ -12658,7 +12669,7 @@
               <w:jc w:val="left"/>
             </w:pPr>
             <w:r>
-              <w:t xml:space="preserve">New items shall be published automatically unless held; changes of price, was-price, stock or photo shall update live items; items missing from a complete feed shall be hidden only if at least half remain; items not refreshed within the source's stale window (default 14 days) shall be hidden.</w:t>
+              <w:t xml:space="preserve">New items shall be published automatically unless held; changes of price, stock or photo shall update live items; items missing from a complete feed shall be hidden only if at least half remain; items not refreshed within the source's stale window (default 14 days) shall be hidden.</w:t>
             </w:r>
           </w:p>
         </w:tc>
@@ -21255,23 +21266,14 @@
               <w:jc w:val="left"/>
             </w:pPr>
             <w:r>
-              <w:t xml:space="preserve">A</w:t>
-            </w:r>
-            <w:r>
-              <w:t xml:space="preserve"> </w:t>
-            </w:r>
-            <w:r>
               <w:rPr>
                 <w:bCs/>
                 <w:b/>
               </w:rPr>
-              <w:t xml:space="preserve">deal</w:t>
-            </w:r>
-            <w:r>
-              <w:t xml:space="preserve"> </w:t>
-            </w:r>
-            <w:r>
-              <w:t xml:space="preserve">is live only while the was-price is higher than the price and the end time (if any) has not passed.</w:t>
+              <w:t xml:space="preserve">No discount claims</w:t>
+            </w:r>
+            <w:r>
+              <w:t xml:space="preserve">: customers see only the shop's current price (in pounds and cedis). The shop never shows a "was" price, a percentage off, or a saving.</w:t>
             </w:r>
           </w:p>
         </w:tc>
@@ -21878,7 +21880,7 @@
         <w:t xml:space="preserve"> </w:t>
       </w:r>
       <w:r>
-        <w:t xml:space="preserve">1. Customer finds an item (browse, search, deals). 2. Chooses options and quantity,</w:t>
+        <w:t xml:space="preserve">1. Customer finds an item (browse or search). 2. Chooses options and quantity,</w:t>
       </w:r>
       <w:r>
         <w:t xml:space="preserve"> </w:t>

</xml_diff>

<commit_message>
Exclude TENS/EMS muscle stimulators and powered massage machines
Battery-powered medical-type devices: imports reject them and never publish; live
ones are taken off the site and out of carts at start-up; link requests for them
are refused (before the rate limiter); staff cannot add them by hand; a public
'Items we cannot ship' page and a terms clause explain why. Docs, SRS and tests
updated.

Co-Authored-By: Claude Sonnet 5.5 <noreply@anthropic.com>
Claude-Session: https://claude.ai/code/session_019DA74PgeWyV7f6WtdreRuq
</commit_message>
<xml_diff>
--- a/docs/pdf/SRS-Anknovate.docx
+++ b/docs/pdf/SRS-Anknovate.docx
@@ -600,7 +600,7 @@
         <w:tab/>
       </w:r>
       <w:r>
-        <w:t>25</w:t>
+        <w:t>26</w:t>
       </w:r>
     </w:p>
     <w:p>
@@ -11924,9 +11924,9 @@
       </w:tblPr>
       <w:tblGrid>
         <w:gridCol w:w="1295"/>
-        <w:gridCol w:w="5120"/>
+        <w:gridCol w:w="5029"/>
         <w:gridCol w:w="605"/>
-        <w:gridCol w:w="2340"/>
+        <w:gridCol w:w="2431"/>
       </w:tblGrid>
       <w:tr>
         <w:trPr>
@@ -11951,7 +11951,7 @@
         </w:tc>
         <w:tc>
           <w:tcPr>
-            <w:tcW w:w="5120" w:type="dxa"/>
+            <w:tcW w:w="5029" w:type="dxa"/>
           </w:tcPr>
           <w:p>
             <w:pPr>
@@ -11979,7 +11979,7 @@
         </w:tc>
         <w:tc>
           <w:tcPr>
-            <w:tcW w:w="2340" w:type="dxa"/>
+            <w:tcW w:w="2431" w:type="dxa"/>
           </w:tcPr>
           <w:p>
             <w:pPr>
@@ -12012,7 +12012,7 @@
         </w:tc>
         <w:tc>
           <w:tcPr>
-            <w:tcW w:w="5120" w:type="dxa"/>
+            <w:tcW w:w="5029" w:type="dxa"/>
           </w:tcPr>
           <w:p>
             <w:pPr>
@@ -12040,7 +12040,7 @@
         </w:tc>
         <w:tc>
           <w:tcPr>
-            <w:tcW w:w="2340" w:type="dxa"/>
+            <w:tcW w:w="2431" w:type="dxa"/>
           </w:tcPr>
           <w:p>
             <w:pPr>
@@ -12095,7 +12095,7 @@
         </w:tc>
         <w:tc>
           <w:tcPr>
-            <w:tcW w:w="5120" w:type="dxa"/>
+            <w:tcW w:w="5029" w:type="dxa"/>
           </w:tcPr>
           <w:p>
             <w:pPr>
@@ -12123,7 +12123,7 @@
         </w:tc>
         <w:tc>
           <w:tcPr>
-            <w:tcW w:w="2340" w:type="dxa"/>
+            <w:tcW w:w="2431" w:type="dxa"/>
           </w:tcPr>
           <w:p>
             <w:pPr>
@@ -12164,7 +12164,7 @@
         </w:tc>
         <w:tc>
           <w:tcPr>
-            <w:tcW w:w="5120" w:type="dxa"/>
+            <w:tcW w:w="5029" w:type="dxa"/>
           </w:tcPr>
           <w:p>
             <w:pPr>
@@ -12209,7 +12209,7 @@
         </w:tc>
         <w:tc>
           <w:tcPr>
-            <w:tcW w:w="2340" w:type="dxa"/>
+            <w:tcW w:w="2431" w:type="dxa"/>
           </w:tcPr>
           <w:p>
             <w:pPr>
@@ -12250,7 +12250,7 @@
         </w:tc>
         <w:tc>
           <w:tcPr>
-            <w:tcW w:w="5120" w:type="dxa"/>
+            <w:tcW w:w="5029" w:type="dxa"/>
           </w:tcPr>
           <w:p>
             <w:pPr>
@@ -12291,7 +12291,7 @@
         </w:tc>
         <w:tc>
           <w:tcPr>
-            <w:tcW w:w="2340" w:type="dxa"/>
+            <w:tcW w:w="2431" w:type="dxa"/>
           </w:tcPr>
           <w:p>
             <w:pPr>
@@ -12329,7 +12329,7 @@
         </w:tc>
         <w:tc>
           <w:tcPr>
-            <w:tcW w:w="5120" w:type="dxa"/>
+            <w:tcW w:w="5029" w:type="dxa"/>
           </w:tcPr>
           <w:p>
             <w:pPr>
@@ -12357,7 +12357,7 @@
         </w:tc>
         <w:tc>
           <w:tcPr>
-            <w:tcW w:w="2340" w:type="dxa"/>
+            <w:tcW w:w="2431" w:type="dxa"/>
           </w:tcPr>
           <w:p>
             <w:pPr>
@@ -12451,7 +12451,7 @@
         </w:tc>
         <w:tc>
           <w:tcPr>
-            <w:tcW w:w="5120" w:type="dxa"/>
+            <w:tcW w:w="5029" w:type="dxa"/>
           </w:tcPr>
           <w:p>
             <w:pPr>
@@ -12479,7 +12479,7 @@
         </w:tc>
         <w:tc>
           <w:tcPr>
-            <w:tcW w:w="2340" w:type="dxa"/>
+            <w:tcW w:w="2431" w:type="dxa"/>
           </w:tcPr>
           <w:p>
             <w:pPr>
@@ -12520,7 +12520,7 @@
         </w:tc>
         <w:tc>
           <w:tcPr>
-            <w:tcW w:w="5120" w:type="dxa"/>
+            <w:tcW w:w="5029" w:type="dxa"/>
           </w:tcPr>
           <w:p>
             <w:pPr>
@@ -12548,7 +12548,7 @@
         </w:tc>
         <w:tc>
           <w:tcPr>
-            <w:tcW w:w="2340" w:type="dxa"/>
+            <w:tcW w:w="2431" w:type="dxa"/>
           </w:tcPr>
           <w:p>
             <w:pPr>
@@ -12589,7 +12589,7 @@
         </w:tc>
         <w:tc>
           <w:tcPr>
-            <w:tcW w:w="5120" w:type="dxa"/>
+            <w:tcW w:w="5029" w:type="dxa"/>
           </w:tcPr>
           <w:p>
             <w:pPr>
@@ -12617,7 +12617,7 @@
         </w:tc>
         <w:tc>
           <w:tcPr>
-            <w:tcW w:w="2340" w:type="dxa"/>
+            <w:tcW w:w="2431" w:type="dxa"/>
           </w:tcPr>
           <w:p>
             <w:pPr>
@@ -12661,7 +12661,7 @@
         </w:tc>
         <w:tc>
           <w:tcPr>
-            <w:tcW w:w="5120" w:type="dxa"/>
+            <w:tcW w:w="5029" w:type="dxa"/>
           </w:tcPr>
           <w:p>
             <w:pPr>
@@ -12689,7 +12689,7 @@
         </w:tc>
         <w:tc>
           <w:tcPr>
-            <w:tcW w:w="2340" w:type="dxa"/>
+            <w:tcW w:w="2431" w:type="dxa"/>
           </w:tcPr>
           <w:p>
             <w:pPr>
@@ -12727,7 +12727,7 @@
         </w:tc>
         <w:tc>
           <w:tcPr>
-            <w:tcW w:w="5120" w:type="dxa"/>
+            <w:tcW w:w="5029" w:type="dxa"/>
           </w:tcPr>
           <w:p>
             <w:pPr>
@@ -12755,7 +12755,7 @@
         </w:tc>
         <w:tc>
           <w:tcPr>
-            <w:tcW w:w="2340" w:type="dxa"/>
+            <w:tcW w:w="2431" w:type="dxa"/>
           </w:tcPr>
           <w:p>
             <w:pPr>
@@ -12793,7 +12793,7 @@
         </w:tc>
         <w:tc>
           <w:tcPr>
-            <w:tcW w:w="5120" w:type="dxa"/>
+            <w:tcW w:w="5029" w:type="dxa"/>
           </w:tcPr>
           <w:p>
             <w:pPr>
@@ -12821,7 +12821,7 @@
         </w:tc>
         <w:tc>
           <w:tcPr>
-            <w:tcW w:w="2340" w:type="dxa"/>
+            <w:tcW w:w="2431" w:type="dxa"/>
           </w:tcPr>
           <w:p>
             <w:pPr>
@@ -12873,7 +12873,7 @@
         </w:tc>
         <w:tc>
           <w:tcPr>
-            <w:tcW w:w="5120" w:type="dxa"/>
+            <w:tcW w:w="5029" w:type="dxa"/>
           </w:tcPr>
           <w:p>
             <w:pPr>
@@ -12901,7 +12901,7 @@
         </w:tc>
         <w:tc>
           <w:tcPr>
-            <w:tcW w:w="2340" w:type="dxa"/>
+            <w:tcW w:w="2431" w:type="dxa"/>
           </w:tcPr>
           <w:p>
             <w:pPr>
@@ -12953,7 +12953,7 @@
         </w:tc>
         <w:tc>
           <w:tcPr>
-            <w:tcW w:w="5120" w:type="dxa"/>
+            <w:tcW w:w="5029" w:type="dxa"/>
           </w:tcPr>
           <w:p>
             <w:pPr>
@@ -12998,7 +12998,7 @@
         </w:tc>
         <w:tc>
           <w:tcPr>
-            <w:tcW w:w="2340" w:type="dxa"/>
+            <w:tcW w:w="2431" w:type="dxa"/>
           </w:tcPr>
           <w:p>
             <w:pPr>
@@ -13050,7 +13050,7 @@
         </w:tc>
         <w:tc>
           <w:tcPr>
-            <w:tcW w:w="5120" w:type="dxa"/>
+            <w:tcW w:w="5029" w:type="dxa"/>
           </w:tcPr>
           <w:p>
             <w:pPr>
@@ -13078,7 +13078,7 @@
         </w:tc>
         <w:tc>
           <w:tcPr>
-            <w:tcW w:w="2340" w:type="dxa"/>
+            <w:tcW w:w="2431" w:type="dxa"/>
           </w:tcPr>
           <w:p>
             <w:pPr>
@@ -13119,7 +13119,7 @@
         </w:tc>
         <w:tc>
           <w:tcPr>
-            <w:tcW w:w="5120" w:type="dxa"/>
+            <w:tcW w:w="5029" w:type="dxa"/>
           </w:tcPr>
           <w:p>
             <w:pPr>
@@ -13147,7 +13147,7 @@
         </w:tc>
         <w:tc>
           <w:tcPr>
-            <w:tcW w:w="2340" w:type="dxa"/>
+            <w:tcW w:w="2431" w:type="dxa"/>
           </w:tcPr>
           <w:p>
             <w:pPr>
@@ -13185,7 +13185,7 @@
         </w:tc>
         <w:tc>
           <w:tcPr>
-            <w:tcW w:w="5120" w:type="dxa"/>
+            <w:tcW w:w="5029" w:type="dxa"/>
           </w:tcPr>
           <w:p>
             <w:pPr>
@@ -13230,7 +13230,7 @@
         </w:tc>
         <w:tc>
           <w:tcPr>
-            <w:tcW w:w="2340" w:type="dxa"/>
+            <w:tcW w:w="2431" w:type="dxa"/>
           </w:tcPr>
           <w:p>
             <w:pPr>
@@ -13268,7 +13268,7 @@
         </w:tc>
         <w:tc>
           <w:tcPr>
-            <w:tcW w:w="5120" w:type="dxa"/>
+            <w:tcW w:w="5029" w:type="dxa"/>
           </w:tcPr>
           <w:p>
             <w:pPr>
@@ -13338,7 +13338,7 @@
         </w:tc>
         <w:tc>
           <w:tcPr>
-            <w:tcW w:w="2340" w:type="dxa"/>
+            <w:tcW w:w="2431" w:type="dxa"/>
           </w:tcPr>
           <w:p>
             <w:pPr>
@@ -13376,7 +13376,7 @@
         </w:tc>
         <w:tc>
           <w:tcPr>
-            <w:tcW w:w="5120" w:type="dxa"/>
+            <w:tcW w:w="5029" w:type="dxa"/>
           </w:tcPr>
           <w:p>
             <w:pPr>
@@ -13404,7 +13404,7 @@
         </w:tc>
         <w:tc>
           <w:tcPr>
-            <w:tcW w:w="2340" w:type="dxa"/>
+            <w:tcW w:w="2431" w:type="dxa"/>
           </w:tcPr>
           <w:p>
             <w:pPr>
@@ -13442,7 +13442,7 @@
         </w:tc>
         <w:tc>
           <w:tcPr>
-            <w:tcW w:w="5120" w:type="dxa"/>
+            <w:tcW w:w="5029" w:type="dxa"/>
           </w:tcPr>
           <w:p>
             <w:pPr>
@@ -13470,7 +13470,7 @@
         </w:tc>
         <w:tc>
           <w:tcPr>
-            <w:tcW w:w="2340" w:type="dxa"/>
+            <w:tcW w:w="2431" w:type="dxa"/>
           </w:tcPr>
           <w:p>
             <w:pPr>
@@ -13522,7 +13522,7 @@
         </w:tc>
         <w:tc>
           <w:tcPr>
-            <w:tcW w:w="5120" w:type="dxa"/>
+            <w:tcW w:w="5029" w:type="dxa"/>
           </w:tcPr>
           <w:p>
             <w:pPr>
@@ -13550,7 +13550,7 @@
         </w:tc>
         <w:tc>
           <w:tcPr>
-            <w:tcW w:w="2340" w:type="dxa"/>
+            <w:tcW w:w="2431" w:type="dxa"/>
           </w:tcPr>
           <w:p>
             <w:pPr>
@@ -13594,7 +13594,7 @@
         </w:tc>
         <w:tc>
           <w:tcPr>
-            <w:tcW w:w="5120" w:type="dxa"/>
+            <w:tcW w:w="5029" w:type="dxa"/>
           </w:tcPr>
           <w:p>
             <w:pPr>
@@ -13622,7 +13622,7 @@
         </w:tc>
         <w:tc>
           <w:tcPr>
-            <w:tcW w:w="2340" w:type="dxa"/>
+            <w:tcW w:w="2431" w:type="dxa"/>
           </w:tcPr>
           <w:p>
             <w:pPr>
@@ -13636,6 +13636,103 @@
                 <w:szCs w:val="16"/>
               </w:rPr>
               <w:t xml:space="preserve">run.test.ts</w:t>
+            </w:r>
+          </w:p>
+        </w:tc>
+      </w:tr>
+      <w:tr>
+        <w:trPr>
+          <w:cantSplit/>
+        </w:trPr>
+        <w:tc>
+          <w:tcPr>
+            <w:tcW w:w="1295" w:type="dxa"/>
+          </w:tcPr>
+          <w:p>
+            <w:pPr>
+              <w:pStyle w:val="Compact"/>
+              <w:jc w:val="left"/>
+            </w:pPr>
+            <w:r>
+              <w:t xml:space="preserve">FR-CAT-35</w:t>
+            </w:r>
+          </w:p>
+        </w:tc>
+        <w:tc>
+          <w:tcPr>
+            <w:tcW w:w="5029" w:type="dxa"/>
+          </w:tcPr>
+          <w:p>
+            <w:pPr>
+              <w:pStyle w:val="Compact"/>
+              <w:jc w:val="left"/>
+            </w:pPr>
+            <w:r>
+              <w:t xml:space="preserve">The system shall not sell muscle stimulators (TENS and EMS) or powered massage machines, which are battery-powered medical-type devices subject to medical-device and air-freight battery rules. Imports shall record such items as rejected and never publish them; any already live shall be taken off the site and out of carts; link requests for them shall be refused; staff shall not be able to add them by hand.</w:t>
+            </w:r>
+          </w:p>
+        </w:tc>
+        <w:tc>
+          <w:tcPr>
+            <w:tcW w:w="605" w:type="dxa"/>
+          </w:tcPr>
+          <w:p>
+            <w:pPr>
+              <w:pStyle w:val="Compact"/>
+              <w:jc w:val="left"/>
+            </w:pPr>
+            <w:r>
+              <w:t xml:space="preserve">M</w:t>
+            </w:r>
+          </w:p>
+        </w:tc>
+        <w:tc>
+          <w:tcPr>
+            <w:tcW w:w="2431" w:type="dxa"/>
+          </w:tcPr>
+          <w:p>
+            <w:pPr>
+              <w:pStyle w:val="Compact"/>
+              <w:jc w:val="left"/>
+            </w:pPr>
+            <w:r>
+              <w:rPr>
+                <w:rStyle w:val="VerbatimChar"/>
+                <w:sz w:val="16"/>
+                <w:szCs w:val="16"/>
+              </w:rPr>
+              <w:t xml:space="preserve">restricted.test.ts</w:t>
+            </w:r>
+            <w:r>
+              <w:t xml:space="preserve">;</w:t>
+            </w:r>
+            <w:r>
+              <w:t xml:space="preserve"> </w:t>
+            </w:r>
+            <w:r>
+              <w:rPr>
+                <w:rStyle w:val="VerbatimChar"/>
+                <w:sz w:val="16"/>
+                <w:szCs w:val="16"/>
+              </w:rPr>
+              <w:t xml:space="preserve">run.test.ts</w:t>
+            </w:r>
+            <w:r>
+              <w:t xml:space="preserve">;</w:t>
+            </w:r>
+            <w:r>
+              <w:t xml:space="preserve"> </w:t>
+            </w:r>
+            <w:r>
+              <w:rPr>
+                <w:rStyle w:val="VerbatimChar"/>
+                <w:sz w:val="16"/>
+                <w:szCs w:val="16"/>
+              </w:rPr>
+              <w:t xml:space="preserve">link-submit.test.ts</w:t>
+            </w:r>
+            <w:r>
+              <w:t xml:space="preserve">; E2E</w:t>
             </w:r>
           </w:p>
         </w:tc>
@@ -21783,6 +21880,49 @@
             </w:r>
             <w:r>
               <w:t xml:space="preserve">: the server recomputes every amount at order creation.</w:t>
+            </w:r>
+          </w:p>
+        </w:tc>
+      </w:tr>
+      <w:tr>
+        <w:trPr>
+          <w:cantSplit/>
+        </w:trPr>
+        <w:tc>
+          <w:tcPr>
+            <w:tcW w:w="850" w:type="dxa"/>
+          </w:tcPr>
+          <w:p>
+            <w:pPr>
+              <w:pStyle w:val="Compact"/>
+              <w:jc w:val="left"/>
+            </w:pPr>
+            <w:r>
+              <w:t xml:space="preserve">BR-21</w:t>
+            </w:r>
+          </w:p>
+        </w:tc>
+        <w:tc>
+          <w:tcPr>
+            <w:tcW w:w="8510" w:type="dxa"/>
+          </w:tcPr>
+          <w:p>
+            <w:pPr>
+              <w:pStyle w:val="Compact"/>
+              <w:jc w:val="left"/>
+            </w:pPr>
+            <w:r>
+              <w:rPr>
+                <w:bCs/>
+                <w:b/>
+              </w:rPr>
+              <w:t xml:space="preserve">Restricted items</w:t>
+            </w:r>
+            <w:r>
+              <w:t xml:space="preserve"> </w:t>
+            </w:r>
+            <w:r>
+              <w:t xml:space="preserve">are never sold: TENS and EMS muscle stimulators and battery-powered massage machines are refused whether they arrive by import, link request or by hand.</w:t>
             </w:r>
           </w:p>
         </w:tc>

</xml_diff>

<commit_message>
Add a cookie policy page and consent banner; shorten the home example order
/cookies lists every cookie; a one-time banner offers Accept all / Essential only as
equals, with a footer control to change it; the optional recently-viewed memory
follows the choice. The hero example order shows items, one combined
'Service, shipping and delivery' line and the total. Docs, SRS, tests and e2e updated.

Co-Authored-By: Claude Sonnet 5.5 <noreply@anthropic.com>
Claude-Session: https://claude.ai/code/session_019DA74PgeWyV7f6WtdreRuq
</commit_message>
<xml_diff>
--- a/docs/pdf/SRS-Anknovate.docx
+++ b/docs/pdf/SRS-Anknovate.docx
@@ -634,7 +634,7 @@
         <w:tab/>
       </w:r>
       <w:r>
-        <w:t>27</w:t>
+        <w:t>28</w:t>
       </w:r>
     </w:p>
     <w:p>
@@ -651,7 +651,7 @@
         <w:tab/>
       </w:r>
       <w:r>
-        <w:t>29</w:t>
+        <w:t>30</w:t>
       </w:r>
     </w:p>
     <w:p>
@@ -668,7 +668,7 @@
         <w:tab/>
       </w:r>
       <w:r>
-        <w:t>31</w:t>
+        <w:t>32</w:t>
       </w:r>
     </w:p>
     <w:p>
@@ -685,7 +685,7 @@
         <w:tab/>
       </w:r>
       <w:r>
-        <w:t>31</w:t>
+        <w:t>32</w:t>
       </w:r>
     </w:p>
     <w:p>
@@ -702,7 +702,7 @@
         <w:tab/>
       </w:r>
       <w:r>
-        <w:t>32</w:t>
+        <w:t>33</w:t>
       </w:r>
     </w:p>
     <w:p>
@@ -719,7 +719,7 @@
         <w:tab/>
       </w:r>
       <w:r>
-        <w:t>33</w:t>
+        <w:t>34</w:t>
       </w:r>
       <w:r>
         <w:fldChar w:fldCharType="end"/>
@@ -15582,9 +15582,9 @@
       </w:tblPr>
       <w:tblGrid>
         <w:gridCol w:w="1295"/>
-        <w:gridCol w:w="4942"/>
+        <w:gridCol w:w="4995"/>
         <w:gridCol w:w="605"/>
-        <w:gridCol w:w="2518"/>
+        <w:gridCol w:w="2465"/>
       </w:tblGrid>
       <w:tr>
         <w:trPr>
@@ -15609,7 +15609,7 @@
         </w:tc>
         <w:tc>
           <w:tcPr>
-            <w:tcW w:w="4942" w:type="dxa"/>
+            <w:tcW w:w="4995" w:type="dxa"/>
           </w:tcPr>
           <w:p>
             <w:pPr>
@@ -15637,7 +15637,7 @@
         </w:tc>
         <w:tc>
           <w:tcPr>
-            <w:tcW w:w="2518" w:type="dxa"/>
+            <w:tcW w:w="2465" w:type="dxa"/>
           </w:tcPr>
           <w:p>
             <w:pPr>
@@ -15670,7 +15670,7 @@
         </w:tc>
         <w:tc>
           <w:tcPr>
-            <w:tcW w:w="4942" w:type="dxa"/>
+            <w:tcW w:w="4995" w:type="dxa"/>
           </w:tcPr>
           <w:p>
             <w:pPr>
@@ -15723,7 +15723,7 @@
         </w:tc>
         <w:tc>
           <w:tcPr>
-            <w:tcW w:w="2518" w:type="dxa"/>
+            <w:tcW w:w="2465" w:type="dxa"/>
           </w:tcPr>
           <w:p>
             <w:pPr>
@@ -15756,7 +15756,7 @@
         </w:tc>
         <w:tc>
           <w:tcPr>
-            <w:tcW w:w="4942" w:type="dxa"/>
+            <w:tcW w:w="4995" w:type="dxa"/>
           </w:tcPr>
           <w:p>
             <w:pPr>
@@ -15823,7 +15823,7 @@
         </w:tc>
         <w:tc>
           <w:tcPr>
-            <w:tcW w:w="2518" w:type="dxa"/>
+            <w:tcW w:w="2465" w:type="dxa"/>
           </w:tcPr>
           <w:p>
             <w:pPr>
@@ -15856,7 +15856,7 @@
         </w:tc>
         <w:tc>
           <w:tcPr>
-            <w:tcW w:w="4942" w:type="dxa"/>
+            <w:tcW w:w="4995" w:type="dxa"/>
           </w:tcPr>
           <w:p>
             <w:pPr>
@@ -15884,7 +15884,7 @@
         </w:tc>
         <w:tc>
           <w:tcPr>
-            <w:tcW w:w="2518" w:type="dxa"/>
+            <w:tcW w:w="2465" w:type="dxa"/>
           </w:tcPr>
           <w:p>
             <w:pPr>
@@ -15950,7 +15950,7 @@
         </w:tc>
         <w:tc>
           <w:tcPr>
-            <w:tcW w:w="4942" w:type="dxa"/>
+            <w:tcW w:w="4995" w:type="dxa"/>
           </w:tcPr>
           <w:p>
             <w:pPr>
@@ -15978,7 +15978,7 @@
         </w:tc>
         <w:tc>
           <w:tcPr>
-            <w:tcW w:w="2518" w:type="dxa"/>
+            <w:tcW w:w="2465" w:type="dxa"/>
           </w:tcPr>
           <w:p>
             <w:pPr>
@@ -16016,7 +16016,7 @@
         </w:tc>
         <w:tc>
           <w:tcPr>
-            <w:tcW w:w="4942" w:type="dxa"/>
+            <w:tcW w:w="4995" w:type="dxa"/>
           </w:tcPr>
           <w:p>
             <w:pPr>
@@ -16061,7 +16061,7 @@
         </w:tc>
         <w:tc>
           <w:tcPr>
-            <w:tcW w:w="2518" w:type="dxa"/>
+            <w:tcW w:w="2465" w:type="dxa"/>
           </w:tcPr>
           <w:p>
             <w:pPr>
@@ -16094,7 +16094,7 @@
         </w:tc>
         <w:tc>
           <w:tcPr>
-            <w:tcW w:w="4942" w:type="dxa"/>
+            <w:tcW w:w="4995" w:type="dxa"/>
           </w:tcPr>
           <w:p>
             <w:pPr>
@@ -16122,7 +16122,7 @@
         </w:tc>
         <w:tc>
           <w:tcPr>
-            <w:tcW w:w="2518" w:type="dxa"/>
+            <w:tcW w:w="2465" w:type="dxa"/>
           </w:tcPr>
           <w:p>
             <w:pPr>
@@ -16166,7 +16166,7 @@
         </w:tc>
         <w:tc>
           <w:tcPr>
-            <w:tcW w:w="4942" w:type="dxa"/>
+            <w:tcW w:w="4995" w:type="dxa"/>
           </w:tcPr>
           <w:p>
             <w:pPr>
@@ -16194,7 +16194,7 @@
         </w:tc>
         <w:tc>
           <w:tcPr>
-            <w:tcW w:w="2518" w:type="dxa"/>
+            <w:tcW w:w="2465" w:type="dxa"/>
           </w:tcPr>
           <w:p>
             <w:pPr>
@@ -16235,7 +16235,7 @@
         </w:tc>
         <w:tc>
           <w:tcPr>
-            <w:tcW w:w="4942" w:type="dxa"/>
+            <w:tcW w:w="4995" w:type="dxa"/>
           </w:tcPr>
           <w:p>
             <w:pPr>
@@ -16274,7 +16274,7 @@
         </w:tc>
         <w:tc>
           <w:tcPr>
-            <w:tcW w:w="2518" w:type="dxa"/>
+            <w:tcW w:w="2465" w:type="dxa"/>
           </w:tcPr>
           <w:p>
             <w:pPr>
@@ -16283,6 +16283,86 @@
             </w:pPr>
             <w:r>
               <w:t xml:space="preserve">E2E checks the page is gone</w:t>
+            </w:r>
+          </w:p>
+        </w:tc>
+      </w:tr>
+      <w:tr>
+        <w:trPr>
+          <w:cantSplit/>
+        </w:trPr>
+        <w:tc>
+          <w:tcPr>
+            <w:tcW w:w="1295" w:type="dxa"/>
+          </w:tcPr>
+          <w:p>
+            <w:pPr>
+              <w:pStyle w:val="Compact"/>
+              <w:jc w:val="left"/>
+            </w:pPr>
+            <w:r>
+              <w:t xml:space="preserve">FR-SYS-09</w:t>
+            </w:r>
+          </w:p>
+        </w:tc>
+        <w:tc>
+          <w:tcPr>
+            <w:tcW w:w="4995" w:type="dxa"/>
+          </w:tcPr>
+          <w:p>
+            <w:pPr>
+              <w:pStyle w:val="Compact"/>
+              <w:jc w:val="left"/>
+            </w:pPr>
+            <w:r>
+              <w:t xml:space="preserve">The shop shall publish a cookie policy (</w:t>
+            </w:r>
+            <w:r>
+              <w:rPr>
+                <w:rStyle w:val="VerbatimChar"/>
+                <w:sz w:val="16"/>
+                <w:szCs w:val="16"/>
+              </w:rPr>
+              <w:t xml:space="preserve">/cookies</w:t>
+            </w:r>
+            <w:r>
+              <w:t xml:space="preserve">) listing every cookie with its purpose and lifetime, and shall ask the visitor once, in a banner, to choose "Accept all" or "Essential only" (equally easy), with a footer control to change the choice later. Only essential cookies shall be set before a choice; the optional "recently viewed" memory shall be saved only after "Accept all" and cleared on "Essential only".</w:t>
+            </w:r>
+          </w:p>
+        </w:tc>
+        <w:tc>
+          <w:tcPr>
+            <w:tcW w:w="605" w:type="dxa"/>
+          </w:tcPr>
+          <w:p>
+            <w:pPr>
+              <w:pStyle w:val="Compact"/>
+              <w:jc w:val="left"/>
+            </w:pPr>
+            <w:r>
+              <w:t xml:space="preserve">M</w:t>
+            </w:r>
+          </w:p>
+        </w:tc>
+        <w:tc>
+          <w:tcPr>
+            <w:tcW w:w="2465" w:type="dxa"/>
+          </w:tcPr>
+          <w:p>
+            <w:pPr>
+              <w:pStyle w:val="Compact"/>
+              <w:jc w:val="left"/>
+            </w:pPr>
+            <w:r>
+              <w:rPr>
+                <w:rStyle w:val="VerbatimChar"/>
+                <w:sz w:val="16"/>
+                <w:szCs w:val="16"/>
+              </w:rPr>
+              <w:t xml:space="preserve">consent.test.ts</w:t>
+            </w:r>
+            <w:r>
+              <w:t xml:space="preserve">; E2E</w:t>
             </w:r>
           </w:p>
         </w:tc>

</xml_diff>